<commit_message>
Deja McCarthy Team como identificacion del equipo
</commit_message>
<xml_diff>
--- a/Unidad_4/Practica_04_Proyecto_Final_OULAD/docs/Articulo_Cientifico_OULAD_APA7.docx
+++ b/Unidad_4/Practica_04_Proyecto_Final_OULAD/docs/Articulo_Cientifico_OULAD_APA7.docx
@@ -64,18 +64,7 @@
         <w:t>Equipo:</w:t>
       </w:r>
       <w:r>
-        <w:t xml:space="preserve"> Mccarthy Team</w:t>
-      </w:r>
-    </w:p>
-    <w:p>
-      <w:r>
-        <w:rPr>
-          <w:b/>
-        </w:rPr>
-        <w:t>Integrantes y matrículas:</w:t>
-      </w:r>
-      <w:r>
-        <w:t xml:space="preserve"> [Completar por el equipo]</w:t>
+        <w:t xml:space="preserve"> McCarthy Team</w:t>
       </w:r>
     </w:p>
     <w:p>

</xml_diff>

<commit_message>
Corrige formato APA del articulo OULAD
</commit_message>
<xml_diff>
--- a/Unidad_4/Practica_04_Proyecto_Final_OULAD/docs/Articulo_Cientifico_OULAD_APA7.docx
+++ b/Unidad_4/Practica_04_Proyecto_Final_OULAD/docs/Articulo_Cientifico_OULAD_APA7.docx
@@ -5,6 +5,9 @@
     <w:p>
       <w:pPr>
         <w:pStyle w:val="Title"/>
+        <w:spacing w:line="480" w:lineRule="auto" w:before="1440" w:after="0"/>
+        <w:ind w:firstLine="0"/>
+        <w:jc w:val="center"/>
       </w:pPr>
       <w:r>
         <w:t>Predicción temprana del desempeño estudiantil mediante aprendizaje automático: análisis de OULAD y un experimento anónimo reproducible</w:t>
@@ -13,12 +16,20 @@
     <w:p>
       <w:pPr>
         <w:pStyle w:val="Heading1"/>
+        <w:spacing w:line="480" w:lineRule="auto" w:before="0" w:after="0"/>
+        <w:ind w:firstLine="0"/>
+        <w:jc w:val="center"/>
       </w:pPr>
       <w:r>
         <w:t>Presentación</w:t>
       </w:r>
     </w:p>
     <w:p>
+      <w:pPr>
+        <w:spacing w:line="480" w:lineRule="auto" w:before="0" w:after="0"/>
+        <w:ind w:firstLine="0"/>
+        <w:jc w:val="center"/>
+      </w:pPr>
       <w:r>
         <w:rPr>
           <w:b/>
@@ -27,6 +38,11 @@
       </w:r>
     </w:p>
     <w:p>
+      <w:pPr>
+        <w:spacing w:line="480" w:lineRule="auto" w:before="0" w:after="0"/>
+        <w:ind w:firstLine="0"/>
+        <w:jc w:val="center"/>
+      </w:pPr>
       <w:r>
         <w:rPr>
           <w:b/>
@@ -35,6 +51,11 @@
       </w:r>
     </w:p>
     <w:p>
+      <w:pPr>
+        <w:spacing w:line="480" w:lineRule="auto" w:before="0" w:after="0"/>
+        <w:ind w:firstLine="0"/>
+        <w:jc w:val="center"/>
+      </w:pPr>
       <w:r>
         <w:rPr>
           <w:b/>
@@ -46,6 +67,11 @@
       </w:r>
     </w:p>
     <w:p>
+      <w:pPr>
+        <w:spacing w:line="480" w:lineRule="auto" w:before="0" w:after="0"/>
+        <w:ind w:firstLine="0"/>
+        <w:jc w:val="center"/>
+      </w:pPr>
       <w:r>
         <w:rPr>
           <w:b/>
@@ -57,6 +83,11 @@
       </w:r>
     </w:p>
     <w:p>
+      <w:pPr>
+        <w:spacing w:line="480" w:lineRule="auto" w:before="0" w:after="0"/>
+        <w:ind w:firstLine="0"/>
+        <w:jc w:val="center"/>
+      </w:pPr>
       <w:r>
         <w:rPr>
           <w:b/>
@@ -68,6 +99,11 @@
       </w:r>
     </w:p>
     <w:p>
+      <w:pPr>
+        <w:spacing w:line="480" w:lineRule="auto" w:before="0" w:after="0"/>
+        <w:ind w:firstLine="0"/>
+        <w:jc w:val="center"/>
+      </w:pPr>
       <w:r>
         <w:rPr>
           <w:b/>
@@ -79,6 +115,11 @@
       </w:r>
     </w:p>
     <w:p>
+      <w:pPr>
+        <w:spacing w:line="480" w:lineRule="auto" w:before="0" w:after="0"/>
+        <w:ind w:firstLine="0"/>
+        <w:jc w:val="center"/>
+      </w:pPr>
       <w:r>
         <w:rPr>
           <w:b/>
@@ -97,92 +138,30 @@
     <w:p>
       <w:pPr>
         <w:pStyle w:val="Heading1"/>
+        <w:spacing w:line="480" w:lineRule="auto" w:before="0" w:after="0"/>
+        <w:ind w:firstLine="0"/>
+        <w:jc w:val="center"/>
       </w:pPr>
       <w:r>
         <w:t>Resumen</w:t>
       </w:r>
     </w:p>
     <w:p>
+      <w:pPr>
+        <w:spacing w:line="480" w:lineRule="auto" w:before="0" w:after="0"/>
+        <w:ind w:firstLine="0"/>
+        <w:jc w:val="left"/>
+      </w:pPr>
       <w:r>
-        <w:t>El objetivo de este estudio fue evaluar si variables demográficas, académicas y de interacción</w:t>
+        <w:t>El objetivo de este estudio fue evaluar si variables demográficas, académicas y de interacción temprana permiten anticipar el desempeño de estudiantes en educación virtual. Se utilizó el Open University Learning Analytics Dataset (OULAD) y se incorporó un Experimento X sintético, anónimo y reproducible para demostrar un escenario complementario sin divulgar información personal. El proceso siguió OSEMN: obtención, depuración, exploración, modelado e interpretación. Se plantearon dos hipótesis: que la interacción durante los primeros 28 días difiere entre quienes aprueban y quienes no, y que las variables tempranas permiten predecir resultados finales y calificaciones. Se trataron valores faltantes mediante imputación, variables ordinales mediante mapas explícitos y variables nominales mediante codificación one-hot. Se compararon regresión logística, bosque aleatorio y gradient boosting en tareas dicotómicas y ordinales; para la variable continua se compararon Ridge, bosque aleatorio y gradient boosting. La evaluación incluyó precisión macro, exhaustividad macro, F1 macro, exactitud, ROC-AUC, error cuadrático medio y R². Además, el F1 binario se verificó manualmente desde TP, FP, TN y FN. El proyecto exporta predicciones caso a caso e importancias de variables. Los hallazgos deben interpretarse como apoyo académico y no como fundamento para decisiones automáticas sin validación institucional, análisis de equidad y supervisión humana.</w:t>
       </w:r>
     </w:p>
     <w:p>
-      <w:r>
-        <w:t>temprana permiten anticipar el desempeño de estudiantes en educación virtual. Se utilizó el</w:t>
-      </w:r>
-    </w:p>
-    <w:p>
-      <w:r>
-        <w:t>Open University Learning Analytics Dataset (OULAD) y se incorporó un Experimento X sintético,</w:t>
-      </w:r>
-    </w:p>
-    <w:p>
-      <w:r>
-        <w:t>anónimo y reproducible para demostrar un escenario complementario sin divulgar información</w:t>
-      </w:r>
-    </w:p>
-    <w:p>
-      <w:r>
-        <w:t>personal. El proceso siguió OSEMN: obtención, depuración, exploración, modelado e</w:t>
-      </w:r>
-    </w:p>
-    <w:p>
-      <w:r>
-        <w:t>interpretación. Se plantearon dos hipótesis: que la interacción durante los primeros 28 días</w:t>
-      </w:r>
-    </w:p>
-    <w:p>
-      <w:r>
-        <w:t>difiere entre quienes aprueban y quienes no, y que las variables tempranas permiten predecir</w:t>
-      </w:r>
-    </w:p>
-    <w:p>
-      <w:r>
-        <w:t>resultados finales y calificaciones. Se trataron valores faltantes mediante imputación,</w:t>
-      </w:r>
-    </w:p>
-    <w:p>
-      <w:r>
-        <w:t>variables ordinales mediante mapas explícitos y variables nominales mediante codificación</w:t>
-      </w:r>
-    </w:p>
-    <w:p>
-      <w:r>
-        <w:t>one-hot. Se compararon regresión logística, bosque aleatorio y gradient boosting en tareas</w:t>
-      </w:r>
-    </w:p>
-    <w:p>
-      <w:r>
-        <w:t>dicotómicas y ordinales; para la variable continua se compararon Ridge, bosque aleatorio y</w:t>
-      </w:r>
-    </w:p>
-    <w:p>
-      <w:r>
-        <w:t>gradient boosting. La evaluación incluyó precisión macro, exhaustividad macro, F1 macro,</w:t>
-      </w:r>
-    </w:p>
-    <w:p>
-      <w:r>
-        <w:t>exactitud, ROC-AUC, error cuadrático medio y R². Además, el F1 binario se verificó manualmente</w:t>
-      </w:r>
-    </w:p>
-    <w:p>
-      <w:r>
-        <w:t>desde TP, FP, TN y FN. El proyecto exporta predicciones caso a caso e importancias de</w:t>
-      </w:r>
-    </w:p>
-    <w:p>
-      <w:r>
-        <w:t>variables. Los hallazgos deben interpretarse como apoyo académico y no como fundamento para</w:t>
-      </w:r>
-    </w:p>
-    <w:p>
-      <w:r>
-        <w:t>decisiones automáticas sin validación institucional, análisis de equidad y supervisión humana.</w:t>
-      </w:r>
-    </w:p>
-    <w:p>
+      <w:pPr>
+        <w:spacing w:line="480" w:lineRule="auto" w:before="0" w:after="0"/>
+        <w:ind w:firstLine="0"/>
+        <w:jc w:val="left"/>
+      </w:pPr>
       <w:r>
         <w:rPr>
           <w:b/>
@@ -190,12 +169,7 @@
         <w:t>Palabras clave:</w:t>
       </w:r>
       <w:r>
-        <w:t xml:space="preserve"> analítica del aprendizaje, OULAD, predicción temprana, aprendizaje</w:t>
-      </w:r>
-    </w:p>
-    <w:p>
-      <w:r>
-        <w:t>automático, rendimiento académico</w:t>
+        <w:t xml:space="preserve"> analítica del aprendizaje, OULAD, predicción temprana, aprendizaje automático, rendimiento académico</w:t>
       </w:r>
     </w:p>
     <w:p>
@@ -206,87 +180,30 @@
     <w:p>
       <w:pPr>
         <w:pStyle w:val="Heading1"/>
+        <w:spacing w:line="480" w:lineRule="auto" w:before="0" w:after="0"/>
+        <w:ind w:firstLine="0"/>
+        <w:jc w:val="center"/>
       </w:pPr>
       <w:r>
         <w:t>Abstract</w:t>
       </w:r>
     </w:p>
     <w:p>
+      <w:pPr>
+        <w:spacing w:line="480" w:lineRule="auto" w:before="0" w:after="0"/>
+        <w:ind w:firstLine="0"/>
+        <w:jc w:val="left"/>
+      </w:pPr>
       <w:r>
-        <w:t>This study evaluated whether demographic, academic, and early-interaction variables can</w:t>
+        <w:t>This study evaluated whether demographic, academic, and early-interaction variables can anticipate student performance in virtual education. The Open University Learning Analytics Dataset (OULAD) was used together with a synthetic, anonymous, and reproducible Experiment X to demonstrate a complementary scenario without disclosing personal information. The workflow followed OSEMN: obtain, scrub, explore, model, and interpret. Two hypotheses were proposed: interaction during the first 28 days differs between students who pass and those who do not, and early variables can predict final outcomes and assessment scores. Missing values were handled through imputation, ordinal variables through explicit mappings, and nominal variables through one-hot encoding. Logistic regression, random forest, and gradient boosting were compared for binary and ordinal tasks; Ridge, random forest, and gradient boosting were compared for the continuous target. Evaluation included macro precision, macro recall, macro F1, accuracy, ROC-AUC, mean squared error, and R². Binary F1 was also verified manually from TP, FP, TN, and FN. The project exports case-level predictions and feature importances. Findings must be interpreted as academic evidence rather than a basis for automated decisions without institutional validation, fairness analysis, and human oversight.</w:t>
       </w:r>
     </w:p>
     <w:p>
-      <w:r>
-        <w:t>anticipate student performance in virtual education. The Open University Learning Analytics</w:t>
-      </w:r>
-    </w:p>
-    <w:p>
-      <w:r>
-        <w:t>Dataset (OULAD) was used together with a synthetic, anonymous, and reproducible Experiment X</w:t>
-      </w:r>
-    </w:p>
-    <w:p>
-      <w:r>
-        <w:t>to demonstrate a complementary scenario without disclosing personal information. The workflow</w:t>
-      </w:r>
-    </w:p>
-    <w:p>
-      <w:r>
-        <w:t>followed OSEMN: obtain, scrub, explore, model, and interpret. Two hypotheses were proposed:</w:t>
-      </w:r>
-    </w:p>
-    <w:p>
-      <w:r>
-        <w:t>interaction during the first 28 days differs between students who pass and those who do not,</w:t>
-      </w:r>
-    </w:p>
-    <w:p>
-      <w:r>
-        <w:t>and early variables can predict final outcomes and assessment scores. Missing values were</w:t>
-      </w:r>
-    </w:p>
-    <w:p>
-      <w:r>
-        <w:t>handled through imputation, ordinal variables through explicit mappings, and nominal variables</w:t>
-      </w:r>
-    </w:p>
-    <w:p>
-      <w:r>
-        <w:t>through one-hot encoding. Logistic regression, random forest, and gradient boosting were</w:t>
-      </w:r>
-    </w:p>
-    <w:p>
-      <w:r>
-        <w:t>compared for binary and ordinal tasks; Ridge, random forest, and gradient boosting were</w:t>
-      </w:r>
-    </w:p>
-    <w:p>
-      <w:r>
-        <w:t>compared for the continuous target. Evaluation included macro precision, macro recall, macro</w:t>
-      </w:r>
-    </w:p>
-    <w:p>
-      <w:r>
-        <w:t>F1, accuracy, ROC-AUC, mean squared error, and R². Binary F1 was also verified manually from</w:t>
-      </w:r>
-    </w:p>
-    <w:p>
-      <w:r>
-        <w:t>TP, FP, TN, and FN. The project exports case-level predictions and feature importances.</w:t>
-      </w:r>
-    </w:p>
-    <w:p>
-      <w:r>
-        <w:t>Findings must be interpreted as academic evidence rather than a basis for automated decisions</w:t>
-      </w:r>
-    </w:p>
-    <w:p>
-      <w:r>
-        <w:t>without institutional validation, fairness analysis, and human oversight.</w:t>
-      </w:r>
-    </w:p>
-    <w:p>
+      <w:pPr>
+        <w:spacing w:line="480" w:lineRule="auto" w:before="0" w:after="0"/>
+        <w:ind w:firstLine="0"/>
+        <w:jc w:val="left"/>
+      </w:pPr>
       <w:r>
         <w:rPr>
           <w:b/>
@@ -294,12 +211,7 @@
         <w:t>Keywords:</w:t>
       </w:r>
       <w:r>
-        <w:t xml:space="preserve"> learning analytics, OULAD, early prediction, machine learning, academic</w:t>
-      </w:r>
-    </w:p>
-    <w:p>
-      <w:r>
-        <w:t>performance</w:t>
+        <w:t xml:space="preserve"> learning analytics, OULAD, early prediction, machine learning, academic performance</w:t>
       </w:r>
     </w:p>
     <w:p>
@@ -310,6 +222,9 @@
     <w:p>
       <w:pPr>
         <w:pStyle w:val="Heading1"/>
+        <w:spacing w:line="480" w:lineRule="auto" w:before="0" w:after="0"/>
+        <w:ind w:firstLine="0"/>
+        <w:jc w:val="center"/>
       </w:pPr>
       <w:r>
         <w:t>Tabla de contenido</w:t>
@@ -317,63 +232,80 @@
     </w:p>
     <w:p>
       <w:pPr>
-        <w:pStyle w:val="ListNumber"/>
+        <w:spacing w:line="480" w:lineRule="auto" w:before="0" w:after="0"/>
+        <w:ind w:firstLine="720"/>
+        <w:jc w:val="left"/>
       </w:pPr>
       <w:r>
-        <w:t>Introducción</w:t>
+        <w:t>1. Introducción</w:t>
+      </w:r>
+    </w:p>
+    <w:p>
+      <w:pPr>
+        <w:spacing w:line="480" w:lineRule="auto" w:before="0" w:after="0"/>
+        <w:ind w:firstLine="720"/>
+        <w:jc w:val="left"/>
+      </w:pPr>
+      <w:r>
+        <w:t>2. Marco de referencia</w:t>
+      </w:r>
+    </w:p>
+    <w:p>
+      <w:pPr>
+        <w:spacing w:line="480" w:lineRule="auto" w:before="0" w:after="0"/>
+        <w:ind w:firstLine="720"/>
+        <w:jc w:val="left"/>
+      </w:pPr>
+      <w:r>
+        <w:t>3. Metodología</w:t>
+      </w:r>
+    </w:p>
+    <w:p>
+      <w:pPr>
+        <w:spacing w:line="480" w:lineRule="auto" w:before="0" w:after="0"/>
+        <w:ind w:firstLine="720"/>
+        <w:jc w:val="left"/>
+      </w:pPr>
+      <w:r>
+        <w:t>4. Hallazgos</w:t>
+      </w:r>
+    </w:p>
+    <w:p>
+      <w:pPr>
+        <w:spacing w:line="480" w:lineRule="auto" w:before="0" w:after="0"/>
+        <w:ind w:firstLine="720"/>
+        <w:jc w:val="left"/>
+      </w:pPr>
+      <w:r>
+        <w:t>5. Discusión</w:t>
+      </w:r>
+    </w:p>
+    <w:p>
+      <w:pPr>
+        <w:spacing w:line="480" w:lineRule="auto" w:before="0" w:after="0"/>
+        <w:ind w:firstLine="720"/>
+        <w:jc w:val="left"/>
+      </w:pPr>
+      <w:r>
+        <w:t>6. Conclusiones</w:t>
+      </w:r>
+    </w:p>
+    <w:p>
+      <w:pPr>
+        <w:spacing w:line="480" w:lineRule="auto" w:before="0" w:after="0"/>
+        <w:ind w:firstLine="720"/>
+        <w:jc w:val="left"/>
+      </w:pPr>
+      <w:r>
+        <w:t>7. Referencias</w:t>
       </w:r>
     </w:p>
     <w:p>
       <w:pPr>
         <w:pStyle w:val="ListNumber"/>
-      </w:pPr>
-      <w:r>
-        <w:t>Marco de referencia</w:t>
-      </w:r>
-    </w:p>
-    <w:p>
-      <w:pPr>
-        <w:pStyle w:val="ListNumber"/>
-      </w:pPr>
-      <w:r>
-        <w:t>Metodología</w:t>
-      </w:r>
-    </w:p>
-    <w:p>
-      <w:pPr>
-        <w:pStyle w:val="ListNumber"/>
-      </w:pPr>
-      <w:r>
-        <w:t>Hallazgos</w:t>
-      </w:r>
-    </w:p>
-    <w:p>
-      <w:pPr>
-        <w:pStyle w:val="ListNumber"/>
-      </w:pPr>
-      <w:r>
-        <w:t>Discusión</w:t>
-      </w:r>
-    </w:p>
-    <w:p>
-      <w:pPr>
-        <w:pStyle w:val="ListNumber"/>
-      </w:pPr>
-      <w:r>
-        <w:t>Conclusiones</w:t>
-      </w:r>
-    </w:p>
-    <w:p>
-      <w:pPr>
-        <w:pStyle w:val="ListNumber"/>
-      </w:pPr>
-      <w:r>
-        <w:t>Referencias</w:t>
-      </w:r>
-    </w:p>
-    <w:p>
-      <w:pPr>
-        <w:pStyle w:val="ListNumber"/>
+        <w:spacing w:line="480" w:lineRule="auto" w:before="0" w:after="0"/>
+        <w:ind w:firstLine="0"/>
+        <w:jc w:val="left"/>
       </w:pPr>
       <w:r>
         <w:t>Anexos</w:t>
@@ -387,247 +319,101 @@
     <w:p>
       <w:pPr>
         <w:pStyle w:val="Heading1"/>
+        <w:spacing w:line="480" w:lineRule="auto" w:before="0" w:after="0"/>
+        <w:ind w:firstLine="0"/>
+        <w:jc w:val="center"/>
       </w:pPr>
       <w:r>
         <w:t>Introducción</w:t>
       </w:r>
     </w:p>
     <w:p>
+      <w:pPr>
+        <w:spacing w:line="480" w:lineRule="auto" w:before="0" w:after="0"/>
+        <w:ind w:firstLine="720"/>
+        <w:jc w:val="left"/>
+      </w:pPr>
       <w:r>
-        <w:t>Los entornos virtuales de aprendizaje registran información sobre acceso a recursos,</w:t>
+        <w:t>Los entornos virtuales de aprendizaje registran información sobre acceso a recursos, participación, evaluaciones y trayectorias académicas. Estos registros pueden apoyar la identificación temprana de estudiantes que necesitan acompañamiento, siempre que el análisis respete criterios de privacidad, validez y equidad. La analítica del aprendizaje no consiste únicamente en entrenar un algoritmo; exige definir una pregunta útil, comprender el momento en que cada variable está disponible y evaluar si el modelo generaliza a observaciones no vistas.</w:t>
       </w:r>
     </w:p>
     <w:p>
+      <w:pPr>
+        <w:spacing w:line="480" w:lineRule="auto" w:before="0" w:after="0"/>
+        <w:ind w:firstLine="720"/>
+        <w:jc w:val="left"/>
+      </w:pPr>
       <w:r>
-        <w:t>participación, evaluaciones y trayectorias académicas. Estos registros pueden apoyar la</w:t>
+        <w:t>Kuzilek et al. (2017) publicaron OULAD para facilitar estudios comparables sobre aprendizaje en línea. El conjunto integra información de 32,593 estudiantes, 22 presentaciones de módulos, resultados de evaluaciones y 10,655,280 registros diarios de interacción. Los autores señalan que el conjunto “contains demographic data together with aggregated clickstream data” (Kuzilek et al., 2017, sección Abstract). Esta combinación permite estudiar tanto factores académicos como patrones de comportamiento digital.</w:t>
       </w:r>
     </w:p>
     <w:p>
+      <w:pPr>
+        <w:spacing w:line="480" w:lineRule="auto" w:before="0" w:after="0"/>
+        <w:ind w:firstLine="720"/>
+        <w:jc w:val="left"/>
+      </w:pPr>
       <w:r>
-        <w:t>identificación temprana de estudiantes que necesitan acompañamiento, siempre que el análisis</w:t>
+        <w:t>El problema de investigación consiste en determinar si la actividad temprana, observada durante los primeros 28 días, contiene información útil para anticipar tres resultados: aprobación dicotómica, resultado final ordinal y promedio de evaluaciones. La ventana temprana se definió antes de agregar las interacciones para reducir la fuga temporal. No se utilizaron el resultado final ni el promedio de evaluaciones como predictores.</w:t>
       </w:r>
     </w:p>
     <w:p>
+      <w:pPr>
+        <w:spacing w:line="480" w:lineRule="auto" w:before="0" w:after="0"/>
+        <w:ind w:firstLine="720"/>
+        <w:jc w:val="left"/>
+      </w:pPr>
       <w:r>
-        <w:t>respete criterios de privacidad, validez y equidad. La analítica del aprendizaje no consiste</w:t>
-      </w:r>
-    </w:p>
-    <w:p>
-      <w:r>
-        <w:t>únicamente en entrenar un algoritmo; exige definir una pregunta útil, comprender el momento en</w:t>
-      </w:r>
-    </w:p>
-    <w:p>
-      <w:r>
-        <w:t>que cada variable está disponible y evaluar si el modelo generaliza a observaciones no vistas.</w:t>
-      </w:r>
-    </w:p>
-    <w:p>
-      <w:r>
-        <w:t>Kuzilek et al. (2017) publicaron OULAD para facilitar estudios comparables sobre aprendizaje</w:t>
-      </w:r>
-    </w:p>
-    <w:p>
-      <w:r>
-        <w:t>en línea. El conjunto integra información de 32,593 estudiantes, 22 presentaciones de módulos,</w:t>
-      </w:r>
-    </w:p>
-    <w:p>
-      <w:r>
-        <w:t>resultados de evaluaciones y 10,655,280 registros diarios de interacción. Los autores señalan</w:t>
-      </w:r>
-    </w:p>
-    <w:p>
-      <w:r>
-        <w:t>que el conjunto “contains demographic data together with aggregated clickstream data”</w:t>
-      </w:r>
-    </w:p>
-    <w:p>
-      <w:r>
-        <w:t>(Kuzilek et al., 2017, sección Abstract). Esta combinación permite estudiar tanto factores</w:t>
-      </w:r>
-    </w:p>
-    <w:p>
-      <w:r>
-        <w:t>académicos como patrones de comportamiento digital.</w:t>
-      </w:r>
-    </w:p>
-    <w:p>
-      <w:r>
-        <w:t>El problema de investigación consiste en determinar si la actividad temprana, observada</w:t>
-      </w:r>
-    </w:p>
-    <w:p>
-      <w:r>
-        <w:t>durante los primeros 28 días, contiene información útil para anticipar tres resultados:</w:t>
-      </w:r>
-    </w:p>
-    <w:p>
-      <w:r>
-        <w:t>aprobación dicotómica, resultado final ordinal y promedio de evaluaciones. La ventana temprana</w:t>
-      </w:r>
-    </w:p>
-    <w:p>
-      <w:r>
-        <w:t>se definió antes de agregar las interacciones para reducir la fuga temporal. No se utilizaron</w:t>
-      </w:r>
-    </w:p>
-    <w:p>
-      <w:r>
-        <w:t>el resultado final ni el promedio de evaluaciones como predictores.</w:t>
-      </w:r>
-    </w:p>
-    <w:p>
-      <w:r>
-        <w:t>El estudio plantea dos hipótesis. H1 sostiene que la distribución de clics tempranos difiere</w:t>
-      </w:r>
-    </w:p>
-    <w:p>
-      <w:r>
-        <w:t>entre estudiantes que aprueban y quienes no aprueban. H2 sostiene que la combinación de</w:t>
-      </w:r>
-    </w:p>
-    <w:p>
-      <w:r>
-        <w:t>interacciones tempranas, antecedentes académicos y variables demográficas permite construir</w:t>
-      </w:r>
-    </w:p>
-    <w:p>
-      <w:r>
-        <w:t>modelos con desempeño superior a una referencia sin información. El objetivo general fue</w:t>
-      </w:r>
-    </w:p>
-    <w:p>
-      <w:r>
-        <w:t>desarrollar un flujo reproducible que cubriera exploración, inferencia, clasificación,</w:t>
-      </w:r>
-    </w:p>
-    <w:p>
-      <w:r>
-        <w:t>predicción ordinal y regresión, además de generar salidas auditables en CSV.</w:t>
+        <w:t>El estudio plantea dos hipótesis. H1 sostiene que la distribución de clics tempranos difiere entre estudiantes que aprueban y quienes no aprueban. H2 sostiene que la combinación de interacciones tempranas, antecedentes académicos y variables demográficas permite construir modelos con desempeño superior a una referencia sin información. El objetivo general fue desarrollar un flujo reproducible que cubriera exploración, inferencia, clasificación, predicción ordinal y regresión, además de generar salidas auditables en CSV.</w:t>
       </w:r>
     </w:p>
     <w:p>
       <w:pPr>
         <w:pStyle w:val="Heading1"/>
+        <w:spacing w:line="480" w:lineRule="auto" w:before="0" w:after="0"/>
+        <w:ind w:firstLine="0"/>
+        <w:jc w:val="center"/>
       </w:pPr>
       <w:r>
         <w:t>Marco de referencia</w:t>
       </w:r>
     </w:p>
     <w:p>
+      <w:pPr>
+        <w:spacing w:line="480" w:lineRule="auto" w:before="0" w:after="0"/>
+        <w:ind w:firstLine="720"/>
+        <w:jc w:val="left"/>
+      </w:pPr>
       <w:r>
-        <w:t>La analítica del aprendizaje estudia datos generados por estudiantes y contextos educativos</w:t>
+        <w:t>La analítica del aprendizaje estudia datos generados por estudiantes y contextos educativos para comprender y optimizar el aprendizaje. OULAD resulta especialmente útil porque enlaza tablas demográficas, inscripciones, evaluaciones e interacciones VLE mediante identificadores anónimos. Según Kuzilek et al. (2017), la anonimización eliminó identificadores privados, generalizó cuasi-identificadores y aplicó criterios de k-anonimato. Por tanto, el conjunto permite experimentación académica, aunque su anonimización no elimina la obligación de usarlo responsablemente.</w:t>
       </w:r>
     </w:p>
     <w:p>
+      <w:pPr>
+        <w:spacing w:line="480" w:lineRule="auto" w:before="0" w:after="0"/>
+        <w:ind w:firstLine="720"/>
+        <w:jc w:val="left"/>
+      </w:pPr>
       <w:r>
-        <w:t>para comprender y optimizar el aprendizaje. OULAD resulta especialmente útil porque enlaza</w:t>
+        <w:t>En aprendizaje supervisado, un modelo aprende una función a partir de ejemplos con variable objetivo conocida. La regresión logística estima probabilidades y ofrece una referencia interpretable para clasificación. El bosque aleatorio combina múltiples árboles construidos sobre muestras y subconjuntos de variables; Breiman (2001) mostró que esta estrategia puede reducir la varianza y capturar relaciones no lineales. Gradient boosting construye modelos de forma secuencial para corregir errores previos (Friedman, 2001). En regresión, Ridge controla la magnitud de coeficientes mediante regularización, mientras los métodos basados en árboles modelan interacciones no lineales.</w:t>
       </w:r>
     </w:p>
     <w:p>
+      <w:pPr>
+        <w:spacing w:line="480" w:lineRule="auto" w:before="0" w:after="0"/>
+        <w:ind w:firstLine="720"/>
+        <w:jc w:val="left"/>
+      </w:pPr>
       <w:r>
-        <w:t>tablas demográficas, inscripciones, evaluaciones e interacciones VLE mediante identificadores</w:t>
-      </w:r>
-    </w:p>
-    <w:p>
-      <w:r>
-        <w:t>anónimos. Según Kuzilek et al. (2017), la anonimización eliminó identificadores privados,</w:t>
-      </w:r>
-    </w:p>
-    <w:p>
-      <w:r>
-        <w:t>generalizó cuasi-identificadores y aplicó criterios de k-anonimato. Por tanto, el conjunto</w:t>
-      </w:r>
-    </w:p>
-    <w:p>
-      <w:r>
-        <w:t>permite experimentación académica, aunque su anonimización no elimina la obligación de usarlo</w:t>
-      </w:r>
-    </w:p>
-    <w:p>
-      <w:r>
-        <w:t>responsablemente.</w:t>
-      </w:r>
-    </w:p>
-    <w:p>
-      <w:r>
-        <w:t>En aprendizaje supervisado, un modelo aprende una función a partir de ejemplos con variable</w:t>
-      </w:r>
-    </w:p>
-    <w:p>
-      <w:r>
-        <w:t>objetivo conocida. La regresión logística estima probabilidades y ofrece una referencia</w:t>
-      </w:r>
-    </w:p>
-    <w:p>
-      <w:r>
-        <w:t>interpretable para clasificación. El bosque aleatorio combina múltiples árboles construidos</w:t>
-      </w:r>
-    </w:p>
-    <w:p>
-      <w:r>
-        <w:t>sobre muestras y subconjuntos de variables; Breiman (2001) mostró que esta estrategia puede</w:t>
-      </w:r>
-    </w:p>
-    <w:p>
-      <w:r>
-        <w:t>reducir la varianza y capturar relaciones no lineales. Gradient boosting construye modelos de</w:t>
-      </w:r>
-    </w:p>
-    <w:p>
-      <w:r>
-        <w:t>forma secuencial para corregir errores previos (Friedman, 2001). En regresión, Ridge controla</w:t>
-      </w:r>
-    </w:p>
-    <w:p>
-      <w:r>
-        <w:t>la magnitud de coeficientes mediante regularización, mientras los métodos basados en árboles</w:t>
-      </w:r>
-    </w:p>
-    <w:p>
-      <w:r>
-        <w:t>modelan interacciones no lineales.</w:t>
-      </w:r>
-    </w:p>
-    <w:p>
-      <w:r>
-        <w:t>Las métricas deben corresponder al problema. En clasificación desbalanceada, la exactitud</w:t>
-      </w:r>
-    </w:p>
-    <w:p>
-      <w:r>
-        <w:t>puede ocultar errores en clases minoritarias, por lo que se complementó con precisión,</w:t>
-      </w:r>
-    </w:p>
-    <w:p>
-      <w:r>
-        <w:t>exhaustividad, F1 macro y ROC-AUC. El F1 es la media armónica entre precisión y</w:t>
-      </w:r>
-    </w:p>
-    <w:p>
-      <w:r>
-        <w:t>exhaustividad. En regresión se utilizaron MSE y R²: el primero penaliza errores grandes y el</w:t>
-      </w:r>
-    </w:p>
-    <w:p>
-      <w:r>
-        <w:t>segundo compara la variabilidad explicada con una predicción basada en la media. Pedregosa et</w:t>
-      </w:r>
-    </w:p>
-    <w:p>
-      <w:r>
-        <w:t>al. (2011) describen scikit-learn como una biblioteca que integra herramientas de</w:t>
-      </w:r>
-    </w:p>
-    <w:p>
-      <w:r>
-        <w:t>preprocesamiento, selección, entrenamiento y evaluación bajo interfaces consistentes.</w:t>
+        <w:t>Las métricas deben corresponder al problema. En clasificación desbalanceada, la exactitud puede ocultar errores en clases minoritarias, por lo que se complementó con precisión, exhaustividad, F1 macro y ROC-AUC. El F1 es la media armónica entre precisión y exhaustividad. En regresión se utilizaron MSE y R²: el primero penaliza errores grandes y el segundo compara la variabilidad explicada con una predicción basada en la media. Pedregosa et al. (2011) describen scikit-learn como una biblioteca que integra herramientas de preprocesamiento, selección, entrenamiento y evaluación bajo interfaces consistentes.</w:t>
       </w:r>
     </w:p>
     <w:p>
       <w:pPr>
         <w:pStyle w:val="Heading1"/>
+        <w:spacing w:line="480" w:lineRule="auto" w:before="0" w:after="0"/>
+        <w:ind w:firstLine="0"/>
+        <w:jc w:val="center"/>
       </w:pPr>
       <w:r>
         <w:t>Metodología</w:t>
@@ -636,19 +422,22 @@
     <w:p>
       <w:pPr>
         <w:pStyle w:val="Heading2"/>
+        <w:spacing w:line="480" w:lineRule="auto" w:before="0" w:after="0"/>
+        <w:ind w:firstLine="0"/>
+        <w:jc w:val="left"/>
       </w:pPr>
       <w:r>
         <w:t>Diseño y fuentes de datos</w:t>
       </w:r>
     </w:p>
     <w:p>
+      <w:pPr>
+        <w:spacing w:line="480" w:lineRule="auto" w:before="0" w:after="0"/>
+        <w:ind w:firstLine="720"/>
+        <w:jc w:val="left"/>
+      </w:pPr>
       <w:r>
-        <w:t>El estudio fue cuantitativo, no experimental y predictivo. La fuente principal fue OULAD,</w:t>
-      </w:r>
-    </w:p>
-    <w:p>
-      <w:r>
-        <w:t xml:space="preserve">publicado bajo licencia CC BY 4.0. Se utilizaron </w:t>
+        <w:t xml:space="preserve">El estudio fue cuantitativo, no experimental y predictivo. La fuente principal fue OULAD, publicado bajo licencia CC BY 4.0. Se utilizaron </w:t>
       </w:r>
       <w:r>
         <w:rPr>
@@ -666,10 +455,8 @@
         <w:t>studentVle.csv</w:t>
       </w:r>
       <w:r>
-        <w:t>,</w:t>
+        <w:t xml:space="preserve">, </w:t>
       </w:r>
-    </w:p>
-    <w:p>
       <w:r>
         <w:rPr>
           <w:rFonts w:ascii="Courier New" w:hAnsi="Courier New"/>
@@ -686,33 +473,26 @@
         <w:t>studentAssessment.csv</w:t>
       </w:r>
       <w:r>
-        <w:t>. La unidad de análisis fue el registro</w:t>
-      </w:r>
-    </w:p>
-    <w:p>
-      <w:r>
-        <w:t>estudiante-módulo-presentación. El Experimento X se generó con semilla fija y variables</w:t>
-      </w:r>
-    </w:p>
-    <w:p>
-      <w:r>
-        <w:t>armonizadas; su función es demostrar cómo integrar una segunda fuente anónima, no representar</w:t>
-      </w:r>
-    </w:p>
-    <w:p>
-      <w:r>
-        <w:t>una institución real.</w:t>
+        <w:t>. La unidad de análisis fue el registro estudiante-módulo-presentación. El Experimento X se generó con semilla fija y variables armonizadas; su función es demostrar cómo integrar una segunda fuente anónima, no representar una institución real.</w:t>
       </w:r>
     </w:p>
     <w:p>
       <w:pPr>
         <w:pStyle w:val="Heading2"/>
+        <w:spacing w:line="480" w:lineRule="auto" w:before="0" w:after="0"/>
+        <w:ind w:firstLine="0"/>
+        <w:jc w:val="left"/>
       </w:pPr>
       <w:r>
         <w:t>Flujo OSEMN y programación</w:t>
       </w:r>
     </w:p>
     <w:p>
+      <w:pPr>
+        <w:spacing w:line="480" w:lineRule="auto" w:before="0" w:after="0"/>
+        <w:ind w:firstLine="720"/>
+        <w:jc w:val="left"/>
+      </w:pPr>
       <w:r>
         <w:t xml:space="preserve">La solución se encapsuló en clases que corresponden a las etapas OSEMN. </w:t>
       </w:r>
@@ -722,10 +502,8 @@
         </w:rPr>
         <w:t>OULADRepository</w:t>
       </w:r>
-    </w:p>
-    <w:p>
       <w:r>
-        <w:t xml:space="preserve">obtiene los archivos y agrega clics; </w:t>
+        <w:t xml:space="preserve"> obtiene los archivos y agrega clics; </w:t>
       </w:r>
       <w:r>
         <w:rPr>
@@ -742,10 +520,8 @@
         </w:rPr>
         <w:t>EDAReporter</w:t>
       </w:r>
-    </w:p>
-    <w:p>
       <w:r>
-        <w:t xml:space="preserve">genera descriptiva y gráficos; </w:t>
+        <w:t xml:space="preserve"> genera descriptiva y gráficos; </w:t>
       </w:r>
       <w:r>
         <w:rPr>
@@ -763,12 +539,7 @@
         <w:t>OULADProject</w:t>
       </w:r>
       <w:r>
-        <w:t xml:space="preserve"> coordina el flujo.</w:t>
-      </w:r>
-    </w:p>
-    <w:p>
-      <w:r>
-        <w:t xml:space="preserve">La clase </w:t>
+        <w:t xml:space="preserve"> coordina el flujo. La clase </w:t>
       </w:r>
       <w:r>
         <w:rPr>
@@ -777,80 +548,48 @@
         <w:t>ResultRegistry</w:t>
       </w:r>
       <w:r>
-        <w:t>, basada en una colección de diccionario, funciona como tipo abstracto</w:t>
+        <w:t>, basada en una colección de diccionario, funciona como tipo abstracto de datos para registrar resultados por tarea y algoritmo.</w:t>
       </w:r>
     </w:p>
     <w:p>
+      <w:pPr>
+        <w:spacing w:line="480" w:lineRule="auto" w:before="0" w:after="0"/>
+        <w:ind w:firstLine="720"/>
+        <w:jc w:val="left"/>
+      </w:pPr>
       <w:r>
-        <w:t>de datos para registrar resultados por tarea y algoritmo.</w:t>
-      </w:r>
-    </w:p>
-    <w:p>
-      <w:r>
-        <w:t>La descarga y todas las salidas usan rutas relativas al folder del proyecto. El archivo</w:t>
-      </w:r>
-    </w:p>
-    <w:p>
-      <w:r>
-        <w:t>comprimido de OULAD permanece fuera del control de versiones. La tabla de interacciones,</w:t>
-      </w:r>
-    </w:p>
-    <w:p>
-      <w:r>
-        <w:t>debido a su tamaño, se procesa en bloques de 500,000 filas. Primero se filtran fechas entre el</w:t>
-      </w:r>
-    </w:p>
-    <w:p>
-      <w:r>
-        <w:t>día 0 y el día 28; después se calculan clics acumulados y días activos por estudiante.</w:t>
+        <w:t>La descarga y todas las salidas usan rutas relativas al folder del proyecto. El archivo comprimido de OULAD permanece fuera del control de versiones. La tabla de interacciones, debido a su tamaño, se procesa en bloques de 500,000 filas. Primero se filtran fechas entre el día 0 y el día 28; después se calculan clics acumulados y días activos por estudiante.</w:t>
       </w:r>
     </w:p>
     <w:p>
       <w:pPr>
         <w:pStyle w:val="Heading2"/>
+        <w:spacing w:line="480" w:lineRule="auto" w:before="0" w:after="0"/>
+        <w:ind w:firstLine="0"/>
+        <w:jc w:val="left"/>
       </w:pPr>
       <w:r>
         <w:t>Variables y preparación</w:t>
       </w:r>
     </w:p>
     <w:p>
+      <w:pPr>
+        <w:spacing w:line="480" w:lineRule="auto" w:before="0" w:after="0"/>
+        <w:ind w:firstLine="720"/>
+        <w:jc w:val="left"/>
+      </w:pPr>
       <w:r>
-        <w:t>Los predictores numéricos fueron clics en 28 días, días activos, créditos estudiados,</w:t>
+        <w:t>Los predictores numéricos fueron clics en 28 días, días activos, créditos estudiados, intentos previos, educación ordinal, edad ordinal y punto medio del índice de privación. Los predictores categóricos fueron género, discapacidad y módulo. La fuente de datos se conservó para auditoría, pero no se incluyó como predictor, evitando que el modelo aprendiera a separar OULAD del experimento sintético.</w:t>
       </w:r>
     </w:p>
     <w:p>
+      <w:pPr>
+        <w:spacing w:line="480" w:lineRule="auto" w:before="0" w:after="0"/>
+        <w:ind w:firstLine="720"/>
+        <w:jc w:val="left"/>
+      </w:pPr>
       <w:r>
-        <w:t>intentos previos, educación ordinal, edad ordinal y punto medio del índice de privación. Los</w:t>
-      </w:r>
-    </w:p>
-    <w:p>
-      <w:r>
-        <w:t>predictores categóricos fueron género, discapacidad y módulo. La fuente de datos se conservó</w:t>
-      </w:r>
-    </w:p>
-    <w:p>
-      <w:r>
-        <w:t>para auditoría, pero no se incluyó como predictor, evitando que el modelo aprendiera a separar</w:t>
-      </w:r>
-    </w:p>
-    <w:p>
-      <w:r>
-        <w:t>OULAD del experimento sintético.</w:t>
-      </w:r>
-    </w:p>
-    <w:p>
-      <w:r>
-        <w:t>Los valores faltantes numéricos se imputaron con la mediana y los categóricos con la moda. Las</w:t>
-      </w:r>
-    </w:p>
-    <w:p>
-      <w:r>
-        <w:t>variables nominales se codificaron mediante one-hot. Educación, edad y resultado final se</w:t>
-      </w:r>
-    </w:p>
-    <w:p>
-      <w:r>
-        <w:t xml:space="preserve">mapearon respetando su orden. La aprobación se definió como </w:t>
+        <w:t xml:space="preserve">Los valores faltantes numéricos se imputaron con la mediana y los categóricos con la moda. Las variables nominales se codificaron mediante one-hot. Educación, edad y resultado final se mapearon respetando su orden. La aprobación se definió como </w:t>
       </w:r>
       <w:r>
         <w:rPr>
@@ -877,10 +616,8 @@
         <w:t>Fail</w:t>
       </w:r>
       <w:r>
-        <w:t xml:space="preserve"> y</w:t>
+        <w:t xml:space="preserve"> y </w:t>
       </w:r>
-    </w:p>
-    <w:p>
       <w:r>
         <w:rPr>
           <w:rFonts w:ascii="Courier New" w:hAnsi="Courier New"/>
@@ -888,68 +625,49 @@
         <w:t>Withdrawn</w:t>
       </w:r>
       <w:r>
-        <w:t xml:space="preserve"> formaron la clase no aprobada. El resultado ordinal se codificó de 0 a 3:</w:t>
-      </w:r>
-    </w:p>
-    <w:p>
-      <w:r>
-        <w:t>retiro, reprobado, aprobado y distinción.</w:t>
+        <w:t xml:space="preserve"> formaron la clase no aprobada. El resultado ordinal se codificó de 0 a 3: retiro, reprobado, aprobado y distinción.</w:t>
       </w:r>
     </w:p>
     <w:p>
       <w:pPr>
         <w:pStyle w:val="Heading2"/>
+        <w:spacing w:line="480" w:lineRule="auto" w:before="0" w:after="0"/>
+        <w:ind w:firstLine="0"/>
+        <w:jc w:val="left"/>
       </w:pPr>
       <w:r>
         <w:t>Análisis exploratorio e hipótesis</w:t>
       </w:r>
     </w:p>
     <w:p>
+      <w:pPr>
+        <w:spacing w:line="480" w:lineRule="auto" w:before="0" w:after="0"/>
+        <w:ind w:firstLine="720"/>
+        <w:jc w:val="left"/>
+      </w:pPr>
       <w:r>
-        <w:t>El EDA incluyó medidas de tendencia y dispersión, asimetría, curtosis, auditoría de faltantes,</w:t>
-      </w:r>
-    </w:p>
-    <w:p>
-      <w:r>
-        <w:t>histogramas, box plots, diagrama de dispersión y matriz de correlación de Spearman. H1 se</w:t>
-      </w:r>
-    </w:p>
-    <w:p>
-      <w:r>
-        <w:t>evaluó mediante Mann-Whitney U porque el conteo de clics es discreto, asimétrico y suele</w:t>
-      </w:r>
-    </w:p>
-    <w:p>
-      <w:r>
-        <w:t>contener valores extremos. Se informó el valor p y una medida de tamaño del efecto basada en</w:t>
-      </w:r>
-    </w:p>
-    <w:p>
-      <w:r>
-        <w:t>rangos. Un resultado significativo no se interpretó como causalidad.</w:t>
+        <w:t>El EDA incluyó medidas de tendencia y dispersión, asimetría, curtosis, auditoría de faltantes, histogramas, box plots, diagrama de dispersión y matriz de correlación de Spearman. H1 se evaluó mediante Mann-Whitney U porque el conteo de clics es discreto, asimétrico y suele contener valores extremos. Se informó el valor p y una medida de tamaño del efecto basada en rangos. Un resultado significativo no se interpretó como causalidad.</w:t>
       </w:r>
     </w:p>
     <w:p>
       <w:pPr>
         <w:pStyle w:val="Heading2"/>
+        <w:spacing w:line="480" w:lineRule="auto" w:before="0" w:after="0"/>
+        <w:ind w:firstLine="0"/>
+        <w:jc w:val="left"/>
       </w:pPr>
       <w:r>
         <w:t>Modelado y evaluación</w:t>
       </w:r>
     </w:p>
     <w:p>
+      <w:pPr>
+        <w:spacing w:line="480" w:lineRule="auto" w:before="0" w:after="0"/>
+        <w:ind w:firstLine="720"/>
+        <w:jc w:val="left"/>
+      </w:pPr>
       <w:r>
-        <w:t>Los datos se dividieron en 75 % entrenamiento y 25 % prueba con semilla fija; las tareas de</w:t>
-      </w:r>
-    </w:p>
-    <w:p>
-      <w:r>
-        <w:t>clasificación conservaron proporciones mediante estratificación. Todo preprocesamiento se</w:t>
-      </w:r>
-    </w:p>
-    <w:p>
-      <w:r>
-        <w:t xml:space="preserve">ajustó dentro de un </w:t>
+        <w:t xml:space="preserve">Los datos se dividieron en 75 % entrenamiento y 25 % prueba con semilla fija; las tareas de clasificación conservaron proporciones mediante estratificación. Todo preprocesamiento se ajustó dentro de un </w:t>
       </w:r>
       <w:r>
         <w:rPr>
@@ -958,155 +676,68 @@
         <w:t>Pipeline</w:t>
       </w:r>
       <w:r>
-        <w:t xml:space="preserve"> usando solo entrenamiento. Para las variables dicotómica y</w:t>
+        <w:t xml:space="preserve"> usando solo entrenamiento. Para las variables dicotómica y ordinal se compararon regresión logística, bosque aleatorio y gradient boosting. Para el promedio de evaluaciones se compararon Ridge, bosque aleatorio y gradient boosting.</w:t>
       </w:r>
     </w:p>
     <w:p>
+      <w:pPr>
+        <w:spacing w:line="480" w:lineRule="auto" w:before="0" w:after="0"/>
+        <w:ind w:firstLine="720"/>
+        <w:jc w:val="left"/>
+      </w:pPr>
       <w:r>
-        <w:t>ordinal se compararon regresión logística, bosque aleatorio y gradient boosting. Para el</w:t>
-      </w:r>
-    </w:p>
-    <w:p>
-      <w:r>
-        <w:t>promedio de evaluaciones se compararon Ridge, bosque aleatorio y gradient boosting.</w:t>
-      </w:r>
-    </w:p>
-    <w:p>
-      <w:r>
-        <w:t>Las métricas binarias y ordinales fueron precisión macro, exhaustividad macro, F1 macro y</w:t>
-      </w:r>
-    </w:p>
-    <w:p>
-      <w:r>
-        <w:t>exactitud. ROC-AUC se calculó para la tarea binaria. La variable ordinal también se evaluó con</w:t>
-      </w:r>
-    </w:p>
-    <w:p>
-      <w:r>
-        <w:t>MSE y R² sobre códigos ordenados. La regresión continua se evaluó con MSE y R². En el caso</w:t>
-      </w:r>
-    </w:p>
-    <w:p>
-      <w:r>
-        <w:t>binario se calcularon TP, FP, TN y FN y se reconstruyeron manualmente precisión,</w:t>
-      </w:r>
-    </w:p>
-    <w:p>
-      <w:r>
-        <w:t>exhaustividad, F1 y exactitud. Finalmente, la importancia por permutación cuantificó cuánto</w:t>
-      </w:r>
-    </w:p>
-    <w:p>
-      <w:r>
-        <w:t>disminuye el desempeño al alterar cada predictor.</w:t>
+        <w:t>Las métricas binarias y ordinales fueron precisión macro, exhaustividad macro, F1 macro y exactitud. ROC-AUC se calculó para la tarea binaria. La variable ordinal también se evaluó con MSE y R² sobre códigos ordenados. La regresión continua se evaluó con MSE y R². En el caso binario se calcularon TP, FP, TN y FN y se reconstruyeron manualmente precisión, exhaustividad, F1 y exactitud. Finalmente, la importancia por permutación cuantificó cuánto disminuye el desempeño al alterar cada predictor.</w:t>
       </w:r>
     </w:p>
     <w:p>
       <w:pPr>
         <w:pStyle w:val="Heading1"/>
+        <w:spacing w:line="480" w:lineRule="auto" w:before="0" w:after="0"/>
+        <w:ind w:firstLine="0"/>
+        <w:jc w:val="center"/>
       </w:pPr>
       <w:r>
         <w:t>Hallazgos</w:t>
       </w:r>
     </w:p>
     <w:p>
+      <w:pPr>
+        <w:spacing w:line="480" w:lineRule="auto" w:before="0" w:after="0"/>
+        <w:ind w:firstLine="720"/>
+        <w:jc w:val="left"/>
+      </w:pPr>
       <w:r>
-        <w:t>La ejecución completa integró 35,093 observaciones de OULAD y Experimento X. Para H1, la</w:t>
+        <w:t>La ejecución completa integró 35,093 observaciones de OULAD y Experimento X. Para H1, la prueba de Mann-Whitney encontró una diferencia estadísticamente significativa entre los clics tempranos de quienes aprobaron y quienes no aprobaron, U = 223,548,383, p &lt; .001, con un efecto biserial por rangos de aproximadamente .455. El grupo que aprobó registró una media de 328.66 clics durante los primeros 28 días, frente a 148.31 en el grupo que no aprobó. Se rechazó H0, pero la asociación no demuestra que aumentar clics por sí solo cause aprobación.</w:t>
       </w:r>
     </w:p>
     <w:p>
+      <w:pPr>
+        <w:spacing w:line="480" w:lineRule="auto" w:before="0" w:after="0"/>
+        <w:ind w:firstLine="720"/>
+        <w:jc w:val="left"/>
+      </w:pPr>
       <w:r>
-        <w:t>prueba de Mann-Whitney encontró una diferencia estadísticamente significativa entre los clics</w:t>
+        <w:t>En la tarea dicotómica, gradient boosting obtuvo el mejor F1 macro (.719), exactitud (.719) y ROC-AUC (.798). El bosque aleatorio logró F1 macro de .714 y ROC-AUC de .788, mientras que la regresión logística alcanzó F1 macro de .706 y ROC-AUC de .784. La proximidad entre resultados indica que el patrón temprano contiene señal estable, aunque el método no lineal produjo una ventaja moderada.</w:t>
       </w:r>
     </w:p>
     <w:p>
+      <w:pPr>
+        <w:spacing w:line="480" w:lineRule="auto" w:before="0" w:after="0"/>
+        <w:ind w:firstLine="720"/>
+        <w:jc w:val="left"/>
+      </w:pPr>
       <w:r>
-        <w:t>tempranos de quienes aprobaron y quienes no aprobaron, U = 223,548,383, p &lt; .001, con un</w:t>
+        <w:t>La clasificación ordinal fue más difícil. El bosque aleatorio obtuvo el mayor F1 macro (.438), pero gradient boosting alcanzó mayor exactitud (.539), menor MSE ordinal (.902) y el único R² ordinal positivo (.062). Esta diferencia muestra por qué no conviene seleccionar un modelo con una sola métrica: F1 favorece equilibrio entre clases, mientras el MSE ordinal penaliza cuánto se aleja la categoría predicha de la verdadera.</w:t>
       </w:r>
     </w:p>
     <w:p>
+      <w:pPr>
+        <w:spacing w:line="480" w:lineRule="auto" w:before="0" w:after="0"/>
+        <w:ind w:firstLine="720"/>
+        <w:jc w:val="left"/>
+      </w:pPr>
       <w:r>
-        <w:t>efecto biserial por rangos de aproximadamente .455. El grupo que aprobó registró una media de</w:t>
-      </w:r>
-    </w:p>
-    <w:p>
-      <w:r>
-        <w:t>328.66 clics durante los primeros 28 días, frente a 148.31 en el grupo que no aprobó. Se</w:t>
-      </w:r>
-    </w:p>
-    <w:p>
-      <w:r>
-        <w:t>rechazó H0, pero la asociación no demuestra que aumentar clics por sí solo cause aprobación.</w:t>
-      </w:r>
-    </w:p>
-    <w:p>
-      <w:r>
-        <w:t>En la tarea dicotómica, gradient boosting obtuvo el mejor F1 macro (.719), exactitud (.719) y</w:t>
-      </w:r>
-    </w:p>
-    <w:p>
-      <w:r>
-        <w:t>ROC-AUC (.798). El bosque aleatorio logró F1 macro de .714 y ROC-AUC de .788, mientras que la</w:t>
-      </w:r>
-    </w:p>
-    <w:p>
-      <w:r>
-        <w:t>regresión logística alcanzó F1 macro de .706 y ROC-AUC de .784. La proximidad entre resultados</w:t>
-      </w:r>
-    </w:p>
-    <w:p>
-      <w:r>
-        <w:t>indica que el patrón temprano contiene señal estable, aunque el método no lineal produjo una</w:t>
-      </w:r>
-    </w:p>
-    <w:p>
-      <w:r>
-        <w:t>ventaja moderada.</w:t>
-      </w:r>
-    </w:p>
-    <w:p>
-      <w:r>
-        <w:t>La clasificación ordinal fue más difícil. El bosque aleatorio obtuvo el mayor F1 macro</w:t>
-      </w:r>
-    </w:p>
-    <w:p>
-      <w:r>
-        <w:t>(.438), pero gradient boosting alcanzó mayor exactitud (.539), menor MSE ordinal (.902) y el</w:t>
-      </w:r>
-    </w:p>
-    <w:p>
-      <w:r>
-        <w:t>único R² ordinal positivo (.062). Esta diferencia muestra por qué no conviene seleccionar un</w:t>
-      </w:r>
-    </w:p>
-    <w:p>
-      <w:r>
-        <w:t>modelo con una sola métrica: F1 favorece equilibrio entre clases, mientras el MSE ordinal</w:t>
-      </w:r>
-    </w:p>
-    <w:p>
-      <w:r>
-        <w:t>penaliza cuánto se aleja la categoría predicha de la verdadera.</w:t>
-      </w:r>
-    </w:p>
-    <w:p>
-      <w:r>
-        <w:t>Para el promedio de evaluaciones, gradient boosting fue el mejor modelo con MSE = 213.491 y</w:t>
-      </w:r>
-    </w:p>
-    <w:p>
-      <w:r>
-        <w:t>R² = .222. Ridge obtuvo MSE = 216.070 y R² = .213; el bosque aleatorio obtuvo MSE = 226.284 y</w:t>
-      </w:r>
-    </w:p>
-    <w:p>
-      <w:r>
-        <w:t>R² = .176. El poder explicativo es limitado, por lo que el modelo no sustituye la evaluación</w:t>
-      </w:r>
-    </w:p>
-    <w:p>
-      <w:r>
-        <w:t xml:space="preserve">académica. Los CSV caso a caso permiten revisar cada error y </w:t>
+        <w:t xml:space="preserve">Para el promedio de evaluaciones, gradient boosting fue el mejor modelo con MSE = 213.491 y R² = .222. Ridge obtuvo MSE = 216.070 y R² = .213; el bosque aleatorio obtuvo MSE = 226.284 y R² = .176. El poder explicativo es limitado, por lo que el modelo no sustituye la evaluación académica. Los CSV caso a caso permiten revisar cada error y </w:t>
       </w:r>
       <w:r>
         <w:rPr>
@@ -1115,88 +746,49 @@
         <w:t>f1_manual.csv</w:t>
       </w:r>
       <w:r>
-        <w:t xml:space="preserve"> confirma el</w:t>
+        <w:t xml:space="preserve"> confirma el cálculo desde TP, FP, TN y FN.</w:t>
       </w:r>
     </w:p>
     <w:p>
+      <w:pPr>
+        <w:spacing w:line="480" w:lineRule="auto" w:before="0" w:after="0"/>
+        <w:ind w:firstLine="720"/>
+        <w:jc w:val="left"/>
+      </w:pPr>
       <w:r>
-        <w:t>cálculo desde TP, FP, TN y FN.</w:t>
-      </w:r>
-    </w:p>
-    <w:p>
-      <w:r>
-        <w:t>Las importancias por permutación identifican las variables que más contribuyen al desempeño</w:t>
-      </w:r>
-    </w:p>
-    <w:p>
-      <w:r>
-        <w:t>predictivo del mejor clasificador. Estas importancias deben interpretarse como contribución a</w:t>
-      </w:r>
-    </w:p>
-    <w:p>
-      <w:r>
-        <w:t>la predicción en esta muestra, no como efectos causales ni como justificación para intervenir</w:t>
-      </w:r>
-    </w:p>
-    <w:p>
-      <w:r>
-        <w:t>sobre atributos demográficos.</w:t>
+        <w:t>Las importancias por permutación identifican las variables que más contribuyen al desempeño predictivo del mejor clasificador. Estas importancias deben interpretarse como contribución a la predicción en esta muestra, no como efectos causales ni como justificación para intervenir sobre atributos demográficos.</w:t>
       </w:r>
     </w:p>
     <w:p>
       <w:pPr>
         <w:pStyle w:val="Heading1"/>
+        <w:spacing w:line="480" w:lineRule="auto" w:before="0" w:after="0"/>
+        <w:ind w:firstLine="0"/>
+        <w:jc w:val="center"/>
       </w:pPr>
       <w:r>
         <w:t>Discusión</w:t>
       </w:r>
     </w:p>
     <w:p>
+      <w:pPr>
+        <w:spacing w:line="480" w:lineRule="auto" w:before="0" w:after="0"/>
+        <w:ind w:firstLine="720"/>
+        <w:jc w:val="left"/>
+      </w:pPr>
       <w:r>
-        <w:t>El proyecto responde a la consigna mediante un diseño que diferencia claramente los tipos de</w:t>
+        <w:t>El proyecto responde a la consigna mediante un diseño que diferencia claramente los tipos de objetivo. La variable dicotómica es apropiada para alertas simples; la ordinal preserva la jerarquía entre retiro, reprobación, aprobación y distinción; la continua permite estimar el promedio de evaluaciones. Esta separación evita aplicar una única métrica o un solo algoritmo a problemas conceptualmente distintos.</w:t>
       </w:r>
     </w:p>
     <w:p>
+      <w:pPr>
+        <w:spacing w:line="480" w:lineRule="auto" w:before="0" w:after="0"/>
+        <w:ind w:firstLine="720"/>
+        <w:jc w:val="left"/>
+      </w:pPr>
       <w:r>
-        <w:t>objetivo. La variable dicotómica es apropiada para alertas simples; la ordinal preserva la</w:t>
+        <w:t xml:space="preserve">La ventana de 28 días fortalece la utilidad práctica porque una predicción temprana puede apoyar intervenciones durante el curso. Sin embargo, todavía existen riesgos de fuga si una variable agregada contiene información generada después del momento de decisión. Por eso el promedio total de evaluaciones se utiliza únicamente como objetivo de regresión. Asimismo, </w:t>
       </w:r>
-    </w:p>
-    <w:p>
-      <w:r>
-        <w:t>jerarquía entre retiro, reprobación, aprobación y distinción; la continua permite estimar el</w:t>
-      </w:r>
-    </w:p>
-    <w:p>
-      <w:r>
-        <w:t>promedio de evaluaciones. Esta separación evita aplicar una única métrica o un solo algoritmo</w:t>
-      </w:r>
-    </w:p>
-    <w:p>
-      <w:r>
-        <w:t>a problemas conceptualmente distintos.</w:t>
-      </w:r>
-    </w:p>
-    <w:p>
-      <w:r>
-        <w:t>La ventana de 28 días fortalece la utilidad práctica porque una predicción temprana puede</w:t>
-      </w:r>
-    </w:p>
-    <w:p>
-      <w:r>
-        <w:t>apoyar intervenciones durante el curso. Sin embargo, todavía existen riesgos de fuga si una</w:t>
-      </w:r>
-    </w:p>
-    <w:p>
-      <w:r>
-        <w:t>variable agregada contiene información generada después del momento de decisión. Por eso el</w:t>
-      </w:r>
-    </w:p>
-    <w:p>
-      <w:r>
-        <w:t>promedio total de evaluaciones se utiliza únicamente como objetivo de regresión. Asimismo,</w:t>
-      </w:r>
-    </w:p>
-    <w:p>
       <w:r>
         <w:rPr>
           <w:rFonts w:ascii="Courier New" w:hAnsi="Courier New"/>
@@ -1208,131 +800,72 @@
       </w:r>
     </w:p>
     <w:p>
+      <w:pPr>
+        <w:spacing w:line="480" w:lineRule="auto" w:before="0" w:after="0"/>
+        <w:ind w:firstLine="720"/>
+        <w:jc w:val="left"/>
+      </w:pPr>
       <w:r>
-        <w:t>Las variables demográficas requieren cautela. Aunque pueden aumentar desempeño, también</w:t>
+        <w:t>Las variables demográficas requieren cautela. Aunque pueden aumentar desempeño, también pueden reproducir desigualdades históricas. Un modelo educativo debe auditar métricas por subgrupos, calibración, estabilidad temporal y costo de falsos negativos. La finalidad razonable es orientar apoyo humano, no sancionar ni excluir estudiantes. La supervisión institucional debe incluir políticas de acceso, explicación, corrección y retiro de datos.</w:t>
       </w:r>
     </w:p>
     <w:p>
+      <w:pPr>
+        <w:spacing w:line="480" w:lineRule="auto" w:before="0" w:after="0"/>
+        <w:ind w:firstLine="720"/>
+        <w:jc w:val="left"/>
+      </w:pPr>
       <w:r>
-        <w:t>pueden reproducir desigualdades históricas. Un modelo educativo debe auditar métricas por</w:t>
-      </w:r>
-    </w:p>
-    <w:p>
-      <w:r>
-        <w:t>subgrupos, calibración, estabilidad temporal y costo de falsos negativos. La finalidad</w:t>
-      </w:r>
-    </w:p>
-    <w:p>
-      <w:r>
-        <w:t>razonable es orientar apoyo humano, no sancionar ni excluir estudiantes. La supervisión</w:t>
-      </w:r>
-    </w:p>
-    <w:p>
-      <w:r>
-        <w:t>institucional debe incluir políticas de acceso, explicación, corrección y retiro de datos.</w:t>
-      </w:r>
-    </w:p>
-    <w:p>
-      <w:r>
-        <w:t>Entre las limitaciones se encuentran la antigüedad de OULAD, las diferencias entre módulos,</w:t>
-      </w:r>
-    </w:p>
-    <w:p>
-      <w:r>
-        <w:t>la naturaleza observacional y la simplificación del Experimento X. La mezcla de fuentes se</w:t>
-      </w:r>
-    </w:p>
-    <w:p>
-      <w:r>
-        <w:t>usa con propósito didáctico y no demuestra transportabilidad entre países o instituciones.</w:t>
-      </w:r>
-    </w:p>
-    <w:p>
-      <w:r>
-        <w:t>Una extensión recomendable consiste en entrenar por presentación temporal, validar en una</w:t>
-      </w:r>
-    </w:p>
-    <w:p>
-      <w:r>
-        <w:t>presentación posterior y comparar desempeño por módulo.</w:t>
+        <w:t>Entre las limitaciones se encuentran la antigüedad de OULAD, las diferencias entre módulos, la naturaleza observacional y la simplificación del Experimento X. La mezcla de fuentes se usa con propósito didáctico y no demuestra transportabilidad entre países o instituciones. Una extensión recomendable consiste en entrenar por presentación temporal, validar en una presentación posterior y comparar desempeño por módulo.</w:t>
       </w:r>
     </w:p>
     <w:p>
       <w:pPr>
         <w:pStyle w:val="Heading1"/>
+        <w:spacing w:line="480" w:lineRule="auto" w:before="0" w:after="0"/>
+        <w:ind w:firstLine="0"/>
+        <w:jc w:val="center"/>
       </w:pPr>
       <w:r>
         <w:t>Conclusiones</w:t>
       </w:r>
     </w:p>
     <w:p>
+      <w:pPr>
+        <w:spacing w:line="480" w:lineRule="auto" w:before="0" w:after="0"/>
+        <w:ind w:firstLine="720"/>
+        <w:jc w:val="left"/>
+      </w:pPr>
       <w:r>
-        <w:t>Se desarrolló un proyecto reproducible de aprendizaje automático que integra OULAD con un</w:t>
+        <w:t>Se desarrolló un proyecto reproducible de aprendizaje automático que integra OULAD con un experimento sintético anónimo, aplica OSEMN y cumple tres tareas predictivas. La arquitectura POO separa obtención, transformación, exploración, modelado e interpretación. El proyecto documenta faltantes, ordinalidad, fuga temporal, métricas y trazabilidad de predicciones.</w:t>
       </w:r>
     </w:p>
     <w:p>
+      <w:pPr>
+        <w:spacing w:line="480" w:lineRule="auto" w:before="0" w:after="0"/>
+        <w:ind w:firstLine="720"/>
+        <w:jc w:val="left"/>
+      </w:pPr>
       <w:r>
-        <w:t>experimento sintético anónimo, aplica OSEMN y cumple tres tareas predictivas. La arquitectura</w:t>
+        <w:t>La primera hipótesis se decide mediante Mann-Whitney U y tamaño del efecto; la segunda se examina comparando nueve combinaciones de tarea y algoritmo sobre un conjunto de prueba. La elección final no debe depender de una sola métrica: en alertas tempranas importan tanto F1 y exhaustividad como ROC-AUC, estabilidad y costo de error. En regresión deben considerarse MSE y R² conjuntamente.</w:t>
       </w:r>
     </w:p>
     <w:p>
+      <w:pPr>
+        <w:spacing w:line="480" w:lineRule="auto" w:before="0" w:after="0"/>
+        <w:ind w:firstLine="720"/>
+        <w:jc w:val="left"/>
+      </w:pPr>
       <w:r>
-        <w:t>POO separa obtención, transformación, exploración, modelado e interpretación. El proyecto</w:t>
-      </w:r>
-    </w:p>
-    <w:p>
-      <w:r>
-        <w:t>documenta faltantes, ordinalidad, fuga temporal, métricas y trazabilidad de predicciones.</w:t>
-      </w:r>
-    </w:p>
-    <w:p>
-      <w:r>
-        <w:t>La primera hipótesis se decide mediante Mann-Whitney U y tamaño del efecto; la segunda se</w:t>
-      </w:r>
-    </w:p>
-    <w:p>
-      <w:r>
-        <w:t>examina comparando nueve combinaciones de tarea y algoritmo sobre un conjunto de prueba. La</w:t>
-      </w:r>
-    </w:p>
-    <w:p>
-      <w:r>
-        <w:t>elección final no debe depender de una sola métrica: en alertas tempranas importan tanto F1 y</w:t>
-      </w:r>
-    </w:p>
-    <w:p>
-      <w:r>
-        <w:t>exhaustividad como ROC-AUC, estabilidad y costo de error. En regresión deben considerarse MSE</w:t>
-      </w:r>
-    </w:p>
-    <w:p>
-      <w:r>
-        <w:t>y R² conjuntamente.</w:t>
-      </w:r>
-    </w:p>
-    <w:p>
-      <w:r>
-        <w:t>El aporte principal no es declarar un algoritmo universalmente superior, sino ofrecer un</w:t>
-      </w:r>
-    </w:p>
-    <w:p>
-      <w:r>
-        <w:t>procedimiento auditable que permite reproducir hallazgos, revisar errores caso a caso e</w:t>
-      </w:r>
-    </w:p>
-    <w:p>
-      <w:r>
-        <w:t>identificar variables influyentes. Antes de un uso real se requiere validación externa,</w:t>
-      </w:r>
-    </w:p>
-    <w:p>
-      <w:r>
-        <w:t>análisis de equidad y supervisión humana.</w:t>
+        <w:t>El aporte principal no es declarar un algoritmo universalmente superior, sino ofrecer un procedimiento auditable que permite reproducir hallazgos, revisar errores caso a caso e identificar variables influyentes. Antes de un uso real se requiere validación externa, análisis de equidad y supervisión humana.</w:t>
       </w:r>
     </w:p>
     <w:p>
       <w:pPr>
         <w:pStyle w:val="Heading1"/>
+        <w:spacing w:line="480" w:lineRule="auto" w:before="0" w:after="0"/>
+        <w:ind w:firstLine="0"/>
+        <w:jc w:val="center"/>
       </w:pPr>
       <w:r>
         <w:t>Referencias</w:t>
@@ -1340,7 +873,9 @@
     </w:p>
     <w:p>
       <w:pPr>
-        <w:ind w:firstLine="0" w:left="720"/>
+        <w:spacing w:line="480" w:lineRule="auto" w:before="0" w:after="0"/>
+        <w:ind w:left="720" w:hanging="720"/>
+        <w:jc w:val="left"/>
       </w:pPr>
       <w:r>
         <w:t xml:space="preserve">Breiman, L. (2001). Random forests. </w:t>
@@ -1352,69 +887,56 @@
         <w:t>Machine Learning, 45</w:t>
       </w:r>
       <w:r>
-        <w:t>, 5-32.</w:t>
+        <w:t>, 5-32. https://doi.org/10.1023/A:1010933404324</w:t>
       </w:r>
     </w:p>
     <w:p>
       <w:pPr>
-        <w:ind w:firstLine="0" w:left="720"/>
+        <w:spacing w:line="480" w:lineRule="auto" w:before="0" w:after="0"/>
+        <w:ind w:left="720" w:hanging="720"/>
+        <w:jc w:val="left"/>
       </w:pPr>
       <w:r>
-        <w:t>https://doi.org/10.1023/A:1010933404324</w:t>
+        <w:t xml:space="preserve">Friedman, J. H. (2001). Greedy function approximation: A gradient boosting machine. </w:t>
+      </w:r>
+      <w:r>
+        <w:rPr>
+          <w:i/>
+        </w:rPr>
+        <w:t>The Annals of Statistics, 29</w:t>
+      </w:r>
+      <w:r>
+        <w:t>(5), 1189-1232. https://doi.org/10.1214/aos/1013203451</w:t>
       </w:r>
     </w:p>
     <w:p>
       <w:pPr>
-        <w:ind w:firstLine="0" w:left="720"/>
+        <w:spacing w:line="480" w:lineRule="auto" w:before="0" w:after="0"/>
+        <w:ind w:left="720" w:hanging="720"/>
+        <w:jc w:val="left"/>
       </w:pPr>
       <w:r>
-        <w:t>Friedman, J. H. (2001). Greedy function approximation: A gradient boosting machine. *The</w:t>
+        <w:t xml:space="preserve">James, G., Witten, D., Hastie, T. y Tibshirani, R. (2021). </w:t>
+      </w:r>
+      <w:r>
+        <w:rPr>
+          <w:i/>
+        </w:rPr>
+        <w:t>An introduction to statistical learning: With applications in R</w:t>
+      </w:r>
+      <w:r>
+        <w:t xml:space="preserve"> (2.ª ed.). Springer. https://doi.org/10.1007/978-1-0716-1418-1</w:t>
       </w:r>
     </w:p>
     <w:p>
       <w:pPr>
-        <w:ind w:firstLine="0" w:left="720"/>
+        <w:spacing w:line="480" w:lineRule="auto" w:before="0" w:after="0"/>
+        <w:ind w:left="720" w:hanging="720"/>
+        <w:jc w:val="left"/>
       </w:pPr>
       <w:r>
-        <w:t>Annals of Statistics, 29*(5), 1189-1232. https://doi.org/10.1214/aos/1013203451</w:t>
+        <w:t xml:space="preserve">Kuzilek, J., Hlosta, M. y Zdrahal, Z. (2017). Open University Learning Analytics dataset. </w:t>
       </w:r>
-    </w:p>
-    <w:p>
-      <w:pPr>
-        <w:ind w:firstLine="0" w:left="720"/>
-      </w:pPr>
-      <w:r>
-        <w:t>James, G., Witten, D., Hastie, T. y Tibshirani, R. (2021). *An introduction to statistical</w:t>
-      </w:r>
-    </w:p>
-    <w:p>
-      <w:pPr>
-        <w:ind w:firstLine="0" w:left="720"/>
-      </w:pPr>
-      <w:r>
-        <w:t>learning: With applications in R* (2.ª ed.). Springer.</w:t>
-      </w:r>
-    </w:p>
-    <w:p>
-      <w:pPr>
-        <w:ind w:firstLine="0" w:left="720"/>
-      </w:pPr>
-      <w:r>
-        <w:t>https://doi.org/10.1007/978-1-0716-1418-1</w:t>
-      </w:r>
-    </w:p>
-    <w:p>
-      <w:pPr>
-        <w:ind w:firstLine="0" w:left="720"/>
-      </w:pPr>
-      <w:r>
-        <w:t>Kuzilek, J., Hlosta, M. y Zdrahal, Z. (2017). Open University Learning Analytics dataset.</w:t>
-      </w:r>
-    </w:p>
-    <w:p>
-      <w:pPr>
-        <w:ind w:firstLine="0" w:left="720"/>
-      </w:pPr>
       <w:r>
         <w:rPr>
           <w:i/>
@@ -1427,32 +949,13 @@
     </w:p>
     <w:p>
       <w:pPr>
-        <w:ind w:firstLine="0" w:left="720"/>
+        <w:spacing w:line="480" w:lineRule="auto" w:before="0" w:after="0"/>
+        <w:ind w:left="720" w:hanging="720"/>
+        <w:jc w:val="left"/>
       </w:pPr>
       <w:r>
-        <w:t>Pedregosa, F., Varoquaux, G., Gramfort, A., Michel, V., Thirion, B., Grisel, O., Blondel,</w:t>
+        <w:t xml:space="preserve">Pedregosa, F., Varoquaux, G., Gramfort, A., Michel, V., Thirion, B., Grisel, O., Blondel, M., Prettenhofer, P., Weiss, R., Dubourg, V., Vanderplas, J., Passos, A., Cournapeau, D., Brucher, M., Perrot, M. y Duchesnay, É. (2011). Scikit-learn: Machine learning in Python. </w:t>
       </w:r>
-    </w:p>
-    <w:p>
-      <w:pPr>
-        <w:ind w:firstLine="0" w:left="720"/>
-      </w:pPr>
-      <w:r>
-        <w:t>M., Prettenhofer, P., Weiss, R., Dubourg, V., Vanderplas, J., Passos, A., Cournapeau, D.,</w:t>
-      </w:r>
-    </w:p>
-    <w:p>
-      <w:pPr>
-        <w:ind w:firstLine="0" w:left="720"/>
-      </w:pPr>
-      <w:r>
-        <w:t>Brucher, M., Perrot, M. y Duchesnay, É. (2011). Scikit-learn: Machine learning in Python.</w:t>
-      </w:r>
-    </w:p>
-    <w:p>
-      <w:pPr>
-        <w:ind w:firstLine="0" w:left="720"/>
-      </w:pPr>
       <w:r>
         <w:rPr>
           <w:i/>
@@ -1466,6 +969,9 @@
     <w:p>
       <w:pPr>
         <w:pStyle w:val="Heading1"/>
+        <w:spacing w:line="480" w:lineRule="auto" w:before="0" w:after="0"/>
+        <w:ind w:firstLine="0"/>
+        <w:jc w:val="center"/>
       </w:pPr>
       <w:r>
         <w:t>Anexos</w:t>
@@ -1474,12 +980,20 @@
     <w:p>
       <w:pPr>
         <w:pStyle w:val="Heading2"/>
+        <w:spacing w:line="480" w:lineRule="auto" w:before="0" w:after="0"/>
+        <w:ind w:firstLine="0"/>
+        <w:jc w:val="left"/>
       </w:pPr>
       <w:r>
         <w:t>Anexo A. Estructura del proyecto</w:t>
       </w:r>
     </w:p>
     <w:p>
+      <w:pPr>
+        <w:spacing w:line="480" w:lineRule="auto" w:before="0" w:after="0"/>
+        <w:ind w:firstLine="720"/>
+        <w:jc w:val="left"/>
+      </w:pPr>
       <w:r>
         <w:t xml:space="preserve">Se incluyen el cuaderno Colab, el paquete </w:t>
       </w:r>
@@ -1490,91 +1004,90 @@
         <w:t>src</w:t>
       </w:r>
       <w:r>
-        <w:t>, pruebas, documentación y salidas CSV. Las</w:t>
+        <w:t>, pruebas, documentación y salidas CSV. Las rutas son relativas y el archivo OULAD se descarga desde UCI.</w:t>
       </w:r>
     </w:p>
     <w:p>
+      <w:pPr>
+        <w:spacing w:line="480" w:lineRule="auto" w:before="0" w:after="0"/>
+        <w:ind w:firstLine="720"/>
+        <w:jc w:val="left"/>
+      </w:pPr>
       <w:r>
-        <w:t>rutas son relativas y el archivo OULAD se descarga desde UCI.</w:t>
+        <w:t>El código, la documentación y las evidencias se encuentran en: https://github.com/marlenis-concepcion/CienciaDatosUasd2026/tree/main/Unidad_4/Practica_04_Proyecto_Final_OULAD</w:t>
       </w:r>
     </w:p>
     <w:p>
+      <w:pPr>
+        <w:spacing w:line="480" w:lineRule="auto" w:before="0" w:after="0"/>
+        <w:ind w:firstLine="720"/>
+        <w:jc w:val="left"/>
+      </w:pPr>
       <w:r>
-        <w:t>El código, la documentación y las evidencias se encuentran en:</w:t>
-      </w:r>
-    </w:p>
-    <w:p>
-      <w:r>
-        <w:t>https://github.com/marlenis-concepcion/CienciaDatosUasd2026/tree/main/Unidad_4/Practica_04_Proyecto_Final_OULAD</w:t>
-      </w:r>
-    </w:p>
-    <w:p>
-      <w:r>
-        <w:t>El cuaderno puede abrirse directamente en Google Colab:</w:t>
-      </w:r>
-    </w:p>
-    <w:p>
-      <w:r>
-        <w:t>https://colab.research.google.com/github/marlenis-concepcion/CienciaDatosUasd2026/blob/main/Unidad_4/Practica_04_Proyecto_Final_OULAD/notebooks/Proyecto_Final_OULAD_Colab.ipynb</w:t>
+        <w:t>El cuaderno puede abrirse directamente en Google Colab: https://colab.research.google.com/github/marlenis-concepcion/CienciaDatosUasd2026/blob/main/Unidad_4/Practica_04_Proyecto_Final_OULAD/notebooks/Proyecto_Final_OULAD_Colab.ipynb</w:t>
       </w:r>
     </w:p>
     <w:p>
       <w:pPr>
         <w:pStyle w:val="Heading2"/>
+        <w:spacing w:line="480" w:lineRule="auto" w:before="0" w:after="0"/>
+        <w:ind w:firstLine="0"/>
+        <w:jc w:val="left"/>
       </w:pPr>
       <w:r>
         <w:t>Anexo B. Salidas reproducibles</w:t>
       </w:r>
     </w:p>
     <w:p>
+      <w:pPr>
+        <w:spacing w:line="480" w:lineRule="auto" w:before="0" w:after="0"/>
+        <w:ind w:firstLine="720"/>
+        <w:jc w:val="left"/>
+      </w:pPr>
       <w:r>
-        <w:t>Las figuras incluyen EDA, box plot, dispersión, correlación y matrices de confusión. Los CSV</w:t>
-      </w:r>
-    </w:p>
-    <w:p>
-      <w:r>
-        <w:t>incluyen métricas generales, predicciones caso a caso, F1 manual e importancias.</w:t>
+        <w:t>Las figuras incluyen EDA, box plot, dispersión, correlación y matrices de confusión. Los CSV incluyen métricas generales, predicciones caso a caso, F1 manual e importancias.</w:t>
       </w:r>
     </w:p>
     <w:p>
       <w:pPr>
         <w:pStyle w:val="Heading2"/>
+        <w:spacing w:line="480" w:lineRule="auto" w:before="0" w:after="0"/>
+        <w:ind w:firstLine="0"/>
+        <w:jc w:val="left"/>
       </w:pPr>
       <w:r>
         <w:t>Anexo C. División del trabajo colaborativo</w:t>
       </w:r>
     </w:p>
     <w:p>
+      <w:pPr>
+        <w:spacing w:line="480" w:lineRule="auto" w:before="0" w:after="0"/>
+        <w:ind w:firstLine="720"/>
+        <w:jc w:val="left"/>
+      </w:pPr>
       <w:r>
-        <w:t>El equipo debe completar la tabla del README con nombres, matrículas, responsabilidad,</w:t>
-      </w:r>
-    </w:p>
-    <w:p>
-      <w:r>
-        <w:t>evidencia revisada y fecha. La integración final debe ser revisada por todos los integrantes.</w:t>
+        <w:t>El equipo debe completar la tabla del README con nombres, matrículas, responsabilidad, evidencia revisada y fecha. La integración final debe ser revisada por todos los integrantes.</w:t>
       </w:r>
     </w:p>
     <w:p>
       <w:pPr>
         <w:pStyle w:val="Heading2"/>
+        <w:spacing w:line="480" w:lineRule="auto" w:before="0" w:after="0"/>
+        <w:ind w:firstLine="0"/>
+        <w:jc w:val="left"/>
       </w:pPr>
       <w:r>
         <w:t>Anexo D. Declaración sobre Experimento X e IA</w:t>
       </w:r>
     </w:p>
     <w:p>
+      <w:pPr>
+        <w:spacing w:line="480" w:lineRule="auto" w:before="0" w:after="0"/>
+        <w:ind w:firstLine="720"/>
+        <w:jc w:val="left"/>
+      </w:pPr>
       <w:r>
-        <w:t>Experimento X es sintético y no representa personas ni una institución real. Se utilizaron</w:t>
-      </w:r>
-    </w:p>
-    <w:p>
-      <w:r>
-        <w:t>herramientas de inteligencia artificial como apoyo para estructuración, programación y</w:t>
-      </w:r>
-    </w:p>
-    <w:p>
-      <w:r>
-        <w:t>revisión; el equipo es responsable de ejecutar, verificar, interpretar y aprobar la entrega.</w:t>
+        <w:t>Experimento X es sintético y no representa personas ni una institución real. Se utilizaron herramientas de inteligencia artificial como apoyo para estructuración, programación y revisión; el equipo es responsable de ejecutar, verificar, interpretar y aprobar la entrega.</w:t>
       </w:r>
     </w:p>
     <w:sectPr>
@@ -1968,8 +1481,9 @@
     <w:qFormat/>
     <w:rsid w:val="00FC693F"/>
     <w:pPr>
-      <w:spacing w:line="480" w:lineRule="auto" w:after="0"/>
+      <w:spacing w:line="480" w:lineRule="auto" w:before="0" w:after="0"/>
       <w:ind w:firstLine="720"/>
+      <w:jc w:val="left"/>
     </w:pPr>
     <w:rPr>
       <w:rFonts w:ascii="Times New Roman" w:hAnsi="Times New Roman"/>
@@ -2031,7 +1545,8 @@
     <w:pPr>
       <w:keepNext/>
       <w:keepLines/>
-      <w:spacing w:before="480" w:after="0"/>
+      <w:spacing w:before="0" w:after="0" w:line="480" w:lineRule="auto"/>
+      <w:ind w:firstLine="0"/>
       <w:jc w:val="center"/>
       <w:outlineLvl w:val="0"/>
     </w:pPr>
@@ -2055,7 +1570,9 @@
     <w:pPr>
       <w:keepNext/>
       <w:keepLines/>
-      <w:spacing w:before="200" w:after="0"/>
+      <w:spacing w:before="0" w:after="0" w:line="480" w:lineRule="auto"/>
+      <w:ind w:firstLine="0"/>
+      <w:jc w:val="left"/>
       <w:outlineLvl w:val="1"/>
     </w:pPr>
     <w:rPr>
@@ -2078,7 +1595,8 @@
     <w:pPr>
       <w:keepNext/>
       <w:keepLines/>
-      <w:spacing w:before="200" w:after="0"/>
+      <w:spacing w:before="0" w:after="0" w:line="480" w:lineRule="auto"/>
+      <w:ind w:firstLine="0"/>
       <w:outlineLvl w:val="2"/>
     </w:pPr>
     <w:rPr>
@@ -2320,7 +1838,8 @@
       <w:pBdr>
         <w:bottom w:val="single" w:sz="8" w:space="4" w:color="4F81BD" w:themeColor="accent1"/>
       </w:pBdr>
-      <w:spacing w:after="300" w:line="240" w:lineRule="auto"/>
+      <w:spacing w:after="0" w:line="480" w:lineRule="auto" w:before="0"/>
+      <w:ind w:firstLine="0"/>
       <w:contextualSpacing/>
       <w:jc w:val="center"/>
     </w:pPr>
@@ -2329,7 +1848,7 @@
       <w:b/>
       <w:spacing w:val="5"/>
       <w:kern w:val="28"/>
-      <w:sz w:val="28"/>
+      <w:sz w:val="24"/>
       <w:szCs w:val="52"/>
     </w:rPr>
   </w:style>

</xml_diff>

<commit_message>
Caso Práctico 2: OULAD en Base de Datos - Schema DDL, ETL, EDA extendido, Paper APA
</commit_message>
<xml_diff>
--- a/Unidad_4/Practica_04_Proyecto_Final_OULAD/docs/Articulo_Cientifico_OULAD_APA7.docx
+++ b/Unidad_4/Practica_04_Proyecto_Final_OULAD/docs/Articulo_Cientifico_OULAD_APA7.docx
@@ -4,130 +4,81 @@
   <w:body>
     <w:p>
       <w:pPr>
-        <w:pStyle w:val="Title"/>
-        <w:spacing w:line="480" w:lineRule="auto" w:before="1440" w:after="0"/>
-        <w:ind w:firstLine="0"/>
+        <w:spacing w:line="480" w:lineRule="auto" w:before="0" w:after="0"/>
         <w:jc w:val="center"/>
       </w:pPr>
       <w:r>
-        <w:t>Predicción temprana del desempeño estudiantil mediante aprendizaje automático: análisis de OULAD y un experimento anónimo reproducible</w:t>
-      </w:r>
-    </w:p>
-    <w:p>
-      <w:pPr>
-        <w:pStyle w:val="Heading1"/>
-        <w:spacing w:line="480" w:lineRule="auto" w:before="0" w:after="0"/>
-        <w:ind w:firstLine="0"/>
-        <w:jc w:val="center"/>
-      </w:pPr>
-      <w:r>
-        <w:t>Presentación</w:t>
+        <w:rPr>
+          <w:b/>
+          <w:sz w:val="28"/>
+        </w:rPr>
+        <w:t>Análisis de Aprendizaje en Entornos Virtuales:</w:t>
+        <w:br/>
+        <w:t>Predicción del Desempeño Académico Usando</w:t>
+        <w:br/>
+        <w:t>Dataset OULAD</w:t>
       </w:r>
     </w:p>
     <w:p>
       <w:pPr>
         <w:spacing w:line="480" w:lineRule="auto" w:before="0" w:after="0"/>
-        <w:ind w:firstLine="0"/>
+        <w:ind w:firstLine="720"/>
+      </w:pPr>
+    </w:p>
+    <w:p>
+      <w:pPr>
+        <w:spacing w:line="480" w:lineRule="auto" w:before="0" w:after="0"/>
+        <w:ind w:firstLine="720"/>
+      </w:pPr>
+    </w:p>
+    <w:p>
+      <w:pPr>
+        <w:spacing w:line="480" w:lineRule="auto" w:before="0" w:after="0"/>
         <w:jc w:val="center"/>
       </w:pPr>
       <w:r>
-        <w:rPr>
-          <w:b/>
-        </w:rPr>
-        <w:t>Universidad Autónoma de Santo Domingo</w:t>
+        <w:t>Equipo de Investigación - McCarthy Team</w:t>
+        <w:br/>
+        <w:t>INF-8237-C2 Ciencia de Datos I</w:t>
       </w:r>
     </w:p>
     <w:p>
       <w:pPr>
         <w:spacing w:line="480" w:lineRule="auto" w:before="0" w:after="0"/>
-        <w:ind w:firstLine="0"/>
+        <w:ind w:firstLine="720"/>
+      </w:pPr>
+    </w:p>
+    <w:p>
+      <w:pPr>
+        <w:spacing w:line="480" w:lineRule="auto" w:before="0" w:after="0"/>
         <w:jc w:val="center"/>
       </w:pPr>
       <w:r>
-        <w:rPr>
-          <w:b/>
-        </w:rPr>
-        <w:t>Facultad de Ingeniería y Arquitectura</w:t>
+        <w:t>Universidad Autónoma de Santo Domingo (UASD)</w:t>
+        <w:br/>
+        <w:t>Facultad de Ciencias</w:t>
+        <w:br/>
       </w:r>
     </w:p>
     <w:p>
       <w:pPr>
         <w:spacing w:line="480" w:lineRule="auto" w:before="0" w:after="0"/>
-        <w:ind w:firstLine="0"/>
-        <w:jc w:val="center"/>
+        <w:ind w:firstLine="720"/>
       </w:pPr>
-      <w:r>
-        <w:rPr>
-          <w:b/>
-        </w:rPr>
-        <w:t>Asignatura:</w:t>
-      </w:r>
-      <w:r>
-        <w:t xml:space="preserve"> INF-8237-C2 Ciencia de Datos I</w:t>
-      </w:r>
     </w:p>
     <w:p>
       <w:pPr>
         <w:spacing w:line="480" w:lineRule="auto" w:before="0" w:after="0"/>
-        <w:ind w:firstLine="0"/>
-        <w:jc w:val="center"/>
+        <w:ind w:firstLine="720"/>
       </w:pPr>
-      <w:r>
-        <w:rPr>
-          <w:b/>
-        </w:rPr>
-        <w:t>Unidad:</w:t>
-      </w:r>
-      <w:r>
-        <w:t xml:space="preserve"> Unidad 4: Introducción a Machine Learning</w:t>
-      </w:r>
     </w:p>
     <w:p>
       <w:pPr>
         <w:spacing w:line="480" w:lineRule="auto" w:before="0" w:after="0"/>
-        <w:ind w:firstLine="0"/>
         <w:jc w:val="center"/>
       </w:pPr>
       <w:r>
-        <w:rPr>
-          <w:b/>
-        </w:rPr>
-        <w:t>Equipo:</w:t>
-      </w:r>
-      <w:r>
-        <w:t xml:space="preserve"> McCarthy Team</w:t>
-      </w:r>
-    </w:p>
-    <w:p>
-      <w:pPr>
-        <w:spacing w:line="480" w:lineRule="auto" w:before="0" w:after="0"/>
-        <w:ind w:firstLine="0"/>
-        <w:jc w:val="center"/>
-      </w:pPr>
-      <w:r>
-        <w:rPr>
-          <w:b/>
-        </w:rPr>
-        <w:t>Facilitador:</w:t>
-      </w:r>
-      <w:r>
-        <w:t xml:space="preserve"> Dr. Silverio del Orbe Abad</w:t>
-      </w:r>
-    </w:p>
-    <w:p>
-      <w:pPr>
-        <w:spacing w:line="480" w:lineRule="auto" w:before="0" w:after="0"/>
-        <w:ind w:firstLine="0"/>
-        <w:jc w:val="center"/>
-      </w:pPr>
-      <w:r>
-        <w:rPr>
-          <w:b/>
-        </w:rPr>
-        <w:t>Fecha:</w:t>
-      </w:r>
-      <w:r>
-        <w:t xml:space="preserve"> 12 de julio de 2026</w:t>
+        <w:t>Junio, 2026</w:t>
       </w:r>
     </w:p>
     <w:p>
@@ -139,37 +90,51 @@
       <w:pPr>
         <w:pStyle w:val="Heading1"/>
         <w:spacing w:line="480" w:lineRule="auto" w:before="0" w:after="0"/>
-        <w:ind w:firstLine="0"/>
-        <w:jc w:val="center"/>
       </w:pPr>
       <w:r>
+        <w:rPr>
+          <w:rFonts w:ascii="Times New Roman" w:hAnsi="Times New Roman"/>
+          <w:b/>
+          <w:i w:val="0"/>
+          <w:sz w:val="24"/>
+        </w:rPr>
         <w:t>Resumen</w:t>
       </w:r>
     </w:p>
     <w:p>
       <w:pPr>
         <w:spacing w:line="480" w:lineRule="auto" w:before="0" w:after="0"/>
-        <w:ind w:firstLine="0"/>
-        <w:jc w:val="left"/>
+        <w:ind w:firstLine="720"/>
       </w:pPr>
       <w:r>
-        <w:t>El objetivo de este estudio fue evaluar si variables demográficas, académicas y de interacción temprana permiten anticipar el desempeño de estudiantes en educación virtual. Se utilizó el Open University Learning Analytics Dataset (OULAD) y se incorporó un Experimento X sintético, anónimo y reproducible para demostrar un escenario complementario sin divulgar información personal. El proceso siguió OSEMN: obtención, depuración, exploración, modelado e interpretación. Se plantearon dos hipótesis: que la interacción durante los primeros 28 días difiere entre quienes aprueban y quienes no, y que las variables tempranas permiten predecir resultados finales y calificaciones. Se trataron valores faltantes mediante imputación, variables ordinales mediante mapas explícitos y variables nominales mediante codificación one-hot. Se compararon regresión logística, bosque aleatorio y gradient boosting en tareas dicotómicas y ordinales; para la variable continua se compararon Ridge, bosque aleatorio y gradient boosting. La evaluación incluyó precisión macro, exhaustividad macro, F1 macro, exactitud, ROC-AUC, error cuadrático medio y R². Además, el F1 binario se verificó manualmente desde TP, FP, TN y FN. El proyecto exporta predicciones caso a caso e importancias de variables. Los hallazgos deben interpretarse como apoyo académico y no como fundamento para decisiones automáticas sin validación institucional, análisis de equidad y supervisión humana.</w:t>
+        <w:rPr>
+          <w:rFonts w:ascii="Times New Roman" w:hAnsi="Times New Roman"/>
+          <w:b w:val="0"/>
+          <w:i w:val="0"/>
+          <w:sz w:val="24"/>
+        </w:rPr>
+        <w:t>Este estudio investiga el desempeño académico de estudiantes en entornos de aprendizaje en línea utilizando el dataset OULAD (Open University Learning Analytics Dataset). Se analizaron 32,593 registros de estudiantes y más de 10.6 millones de interacciones en el entorno virtual de aprendizaje (VLE). Empleando técnicas de análisis exploratorio de datos (EDA) y modelado predictivo, se identificaron patrones de interacción temprana asociados con el desempeño final. Los resultados muestran que la actividad en los primeros 28 días y características demográficas son predictoras significativas del éxito académico. Este análisis proporciona información valiosa para intervenciones pedagógicas tempranas y mejora de la experiencia de aprendizaje en línea.</w:t>
       </w:r>
     </w:p>
     <w:p>
       <w:pPr>
         <w:spacing w:line="480" w:lineRule="auto" w:before="0" w:after="0"/>
-        <w:ind w:firstLine="0"/>
-        <w:jc w:val="left"/>
+        <w:ind w:firstLine="720"/>
       </w:pPr>
       <w:r>
         <w:rPr>
+          <w:rFonts w:ascii="Times New Roman" w:hAnsi="Times New Roman"/>
           <w:b/>
+          <w:sz w:val="24"/>
         </w:rPr>
-        <w:t>Palabras clave:</w:t>
+        <w:t xml:space="preserve">Palabras clave: </w:t>
       </w:r>
       <w:r>
-        <w:t xml:space="preserve"> analítica del aprendizaje, OULAD, predicción temprana, aprendizaje automático, rendimiento académico</w:t>
+        <w:rPr>
+          <w:rFonts w:ascii="Times New Roman" w:hAnsi="Times New Roman"/>
+          <w:sz w:val="24"/>
+        </w:rPr>
+        <w:t>aprendizaje en línea, análisis de datos educativos, predicción de desempeño académico, minería de datos educativa, entornos virtuales de aprendizaje</w:t>
       </w:r>
     </w:p>
     <w:p>
@@ -181,37 +146,60 @@
       <w:pPr>
         <w:pStyle w:val="Heading1"/>
         <w:spacing w:line="480" w:lineRule="auto" w:before="0" w:after="0"/>
-        <w:ind w:firstLine="0"/>
-        <w:jc w:val="center"/>
       </w:pPr>
       <w:r>
-        <w:t>Abstract</w:t>
+        <w:rPr>
+          <w:rFonts w:ascii="Times New Roman" w:hAnsi="Times New Roman"/>
+          <w:b/>
+          <w:i w:val="0"/>
+          <w:sz w:val="24"/>
+        </w:rPr>
+        <w:t>Introducción</w:t>
       </w:r>
     </w:p>
     <w:p>
       <w:pPr>
         <w:spacing w:line="480" w:lineRule="auto" w:before="0" w:after="0"/>
-        <w:ind w:firstLine="0"/>
-        <w:jc w:val="left"/>
+        <w:ind w:firstLine="720"/>
       </w:pPr>
       <w:r>
-        <w:t>This study evaluated whether demographic, academic, and early-interaction variables can anticipate student performance in virtual education. The Open University Learning Analytics Dataset (OULAD) was used together with a synthetic, anonymous, and reproducible Experiment X to demonstrate a complementary scenario without disclosing personal information. The workflow followed OSEMN: obtain, scrub, explore, model, and interpret. Two hypotheses were proposed: interaction during the first 28 days differs between students who pass and those who do not, and early variables can predict final outcomes and assessment scores. Missing values were handled through imputation, ordinal variables through explicit mappings, and nominal variables through one-hot encoding. Logistic regression, random forest, and gradient boosting were compared for binary and ordinal tasks; Ridge, random forest, and gradient boosting were compared for the continuous target. Evaluation included macro precision, macro recall, macro F1, accuracy, ROC-AUC, mean squared error, and R². Binary F1 was also verified manually from TP, FP, TN, and FN. The project exports case-level predictions and feature importances. Findings must be interpreted as academic evidence rather than a basis for automated decisions without institutional validation, fairness analysis, and human oversight.</w:t>
+        <w:rPr>
+          <w:rFonts w:ascii="Times New Roman" w:hAnsi="Times New Roman"/>
+          <w:b w:val="0"/>
+          <w:i w:val="0"/>
+          <w:sz w:val="24"/>
+        </w:rPr>
+        <w:t>El aprendizaje en línea ha experimentado un crecimiento exponencial en las últimas décadas, especialmente con los avances tecnológicos y la adopción global de plataformas educativas virtuales. Las universidades abiertas, como la Open University del Reino Unido, han acumulado datos masivos sobre interacciones de estudiantes, comportamientos de aprendizaje y resultados académicos. Estos datos representan una oportunidad única para investigadores en análisis de datos educativos (Educational Data Mining).</w:t>
       </w:r>
     </w:p>
     <w:p>
       <w:pPr>
         <w:spacing w:line="480" w:lineRule="auto" w:before="0" w:after="0"/>
-        <w:ind w:firstLine="0"/>
-        <w:jc w:val="left"/>
+        <w:ind w:firstLine="720"/>
       </w:pPr>
       <w:r>
         <w:rPr>
-          <w:b/>
+          <w:rFonts w:ascii="Times New Roman" w:hAnsi="Times New Roman"/>
+          <w:b w:val="0"/>
+          <w:i w:val="0"/>
+          <w:sz w:val="24"/>
         </w:rPr>
-        <w:t>Keywords:</w:t>
+        <w:t>El dataset OULAD contiene información sobre estudiantes, sus características demográficas, interacciones con el entorno virtual de aprendizaje (VLE) y desempeño en evaluaciones. Comprender qué factores predicen el éxito académico es fundamental para desarrollar estrategias de intervención temprana y mejorar las tasas de retención estudiantil.</w:t>
       </w:r>
+    </w:p>
+    <w:p>
+      <w:pPr>
+        <w:spacing w:line="480" w:lineRule="auto" w:before="0" w:after="0"/>
+        <w:ind w:firstLine="720"/>
+      </w:pPr>
       <w:r>
-        <w:t xml:space="preserve"> learning analytics, OULAD, early prediction, machine learning, academic performance</w:t>
+        <w:rPr>
+          <w:rFonts w:ascii="Times New Roman" w:hAnsi="Times New Roman"/>
+          <w:b w:val="0"/>
+          <w:i w:val="0"/>
+          <w:sz w:val="24"/>
+        </w:rPr>
+        <w:t>Este estudio aplica técnicas avanzadas de análisis exploratorio de datos y modelado predictivo al dataset OULAD para identificar patrones de comportamiento asociados con el éxito académico. Se hipotetiza que la actividad temprana en el VLE y características académicas previas son predictores significativos del resultado final.</w:t>
       </w:r>
     </w:p>
     <w:p>
@@ -223,92 +211,105 @@
       <w:pPr>
         <w:pStyle w:val="Heading1"/>
         <w:spacing w:line="480" w:lineRule="auto" w:before="0" w:after="0"/>
-        <w:ind w:firstLine="0"/>
-        <w:jc w:val="center"/>
       </w:pPr>
       <w:r>
-        <w:t>Tabla de contenido</w:t>
+        <w:rPr>
+          <w:rFonts w:ascii="Times New Roman" w:hAnsi="Times New Roman"/>
+          <w:b/>
+          <w:i w:val="0"/>
+          <w:sz w:val="24"/>
+        </w:rPr>
+        <w:t>Revisión de Literatura</w:t>
+      </w:r>
+    </w:p>
+    <w:p>
+      <w:pPr>
+        <w:pStyle w:val="Heading2"/>
+        <w:spacing w:line="480" w:lineRule="auto" w:before="0" w:after="0"/>
+      </w:pPr>
+      <w:r>
+        <w:rPr>
+          <w:rFonts w:ascii="Times New Roman" w:hAnsi="Times New Roman"/>
+          <w:b/>
+          <w:i w:val="0"/>
+          <w:sz w:val="24"/>
+        </w:rPr>
+        <w:t>Minería de Datos Educativa</w:t>
       </w:r>
     </w:p>
     <w:p>
       <w:pPr>
         <w:spacing w:line="480" w:lineRule="auto" w:before="0" w:after="0"/>
         <w:ind w:firstLine="720"/>
-        <w:jc w:val="left"/>
       </w:pPr>
       <w:r>
-        <w:t>1. Introducción</w:t>
+        <w:rPr>
+          <w:rFonts w:ascii="Times New Roman" w:hAnsi="Times New Roman"/>
+          <w:b w:val="0"/>
+          <w:i w:val="0"/>
+          <w:sz w:val="24"/>
+        </w:rPr>
+        <w:t>La minería de datos educativa (Educational Data Mining) es un campo interdisciplinario que aplica técnicas de análisis de datos, estadística y aprendizaje automático a conjuntos de datos educativos (Baker &amp; Yacef, 2009). Este enfoque ha demostrado ser efectivo para identificar estudiantes en riesgo, mejorar la calidad del contenido educativo y personalizar experiencias de aprendizaje.</w:t>
+      </w:r>
+    </w:p>
+    <w:p>
+      <w:pPr>
+        <w:pStyle w:val="Heading2"/>
+        <w:spacing w:line="480" w:lineRule="auto" w:before="0" w:after="0"/>
+      </w:pPr>
+      <w:r>
+        <w:rPr>
+          <w:rFonts w:ascii="Times New Roman" w:hAnsi="Times New Roman"/>
+          <w:b/>
+          <w:i w:val="0"/>
+          <w:sz w:val="24"/>
+        </w:rPr>
+        <w:t>Análisis de Comportamiento en Entornos Virtuales</w:t>
       </w:r>
     </w:p>
     <w:p>
       <w:pPr>
         <w:spacing w:line="480" w:lineRule="auto" w:before="0" w:after="0"/>
         <w:ind w:firstLine="720"/>
-        <w:jc w:val="left"/>
       </w:pPr>
       <w:r>
-        <w:t>2. Marco de referencia</w:t>
+        <w:rPr>
+          <w:rFonts w:ascii="Times New Roman" w:hAnsi="Times New Roman"/>
+          <w:b w:val="0"/>
+          <w:i w:val="0"/>
+          <w:sz w:val="24"/>
+        </w:rPr>
+        <w:t>Los entornos virtuales de aprendizaje generan datos detallados sobre cómo los estudiantes interactúan con recursos educativos. La cantidad de clics, el tiempo dedicado, y la frecuencia de acceso son indicadores de engagement que se correlacionan con desempeño académico (Siemens &amp; D. Baker, 2012). Investigaciones previas han mostrado que la actividad temprana en las primeras semanas es un predictor fuerte del resultado final.</w:t>
+      </w:r>
+    </w:p>
+    <w:p>
+      <w:pPr>
+        <w:pStyle w:val="Heading2"/>
+        <w:spacing w:line="480" w:lineRule="auto" w:before="0" w:after="0"/>
+      </w:pPr>
+      <w:r>
+        <w:rPr>
+          <w:rFonts w:ascii="Times New Roman" w:hAnsi="Times New Roman"/>
+          <w:b/>
+          <w:i w:val="0"/>
+          <w:sz w:val="24"/>
+        </w:rPr>
+        <w:t>Predictores de Desempeño Académico</w:t>
       </w:r>
     </w:p>
     <w:p>
       <w:pPr>
         <w:spacing w:line="480" w:lineRule="auto" w:before="0" w:after="0"/>
         <w:ind w:firstLine="720"/>
-        <w:jc w:val="left"/>
       </w:pPr>
       <w:r>
-        <w:t>3. Metodología</w:t>
-      </w:r>
-    </w:p>
-    <w:p>
-      <w:pPr>
-        <w:spacing w:line="480" w:lineRule="auto" w:before="0" w:after="0"/>
-        <w:ind w:firstLine="720"/>
-        <w:jc w:val="left"/>
-      </w:pPr>
-      <w:r>
-        <w:t>4. Hallazgos</w:t>
-      </w:r>
-    </w:p>
-    <w:p>
-      <w:pPr>
-        <w:spacing w:line="480" w:lineRule="auto" w:before="0" w:after="0"/>
-        <w:ind w:firstLine="720"/>
-        <w:jc w:val="left"/>
-      </w:pPr>
-      <w:r>
-        <w:t>5. Discusión</w:t>
-      </w:r>
-    </w:p>
-    <w:p>
-      <w:pPr>
-        <w:spacing w:line="480" w:lineRule="auto" w:before="0" w:after="0"/>
-        <w:ind w:firstLine="720"/>
-        <w:jc w:val="left"/>
-      </w:pPr>
-      <w:r>
-        <w:t>6. Conclusiones</w:t>
-      </w:r>
-    </w:p>
-    <w:p>
-      <w:pPr>
-        <w:spacing w:line="480" w:lineRule="auto" w:before="0" w:after="0"/>
-        <w:ind w:firstLine="720"/>
-        <w:jc w:val="left"/>
-      </w:pPr>
-      <w:r>
-        <w:t>7. Referencias</w:t>
-      </w:r>
-    </w:p>
-    <w:p>
-      <w:pPr>
-        <w:pStyle w:val="ListNumber"/>
-        <w:spacing w:line="480" w:lineRule="auto" w:before="0" w:after="0"/>
-        <w:ind w:firstLine="0"/>
-        <w:jc w:val="left"/>
-      </w:pPr>
-      <w:r>
-        <w:t>Anexos</w:t>
+        <w:rPr>
+          <w:rFonts w:ascii="Times New Roman" w:hAnsi="Times New Roman"/>
+          <w:b w:val="0"/>
+          <w:i w:val="0"/>
+          <w:sz w:val="24"/>
+        </w:rPr>
+        <w:t>Múltiples estudios han identificado factores que predicen el desempeño académico. Estos incluyen características demográficas (género, edad, educación previa), características académicas (créditos estudiados, intentos previos) y patrones de comportamiento en línea. Los enfoques de machine learning han demostrado mejorar la precisión predictiva al combinar múltiples fuentes de datos.</w:t>
       </w:r>
     </w:p>
     <w:p>
@@ -320,102 +321,14 @@
       <w:pPr>
         <w:pStyle w:val="Heading1"/>
         <w:spacing w:line="480" w:lineRule="auto" w:before="0" w:after="0"/>
-        <w:ind w:firstLine="0"/>
-        <w:jc w:val="center"/>
       </w:pPr>
       <w:r>
-        <w:t>Introducción</w:t>
-      </w:r>
-    </w:p>
-    <w:p>
-      <w:pPr>
-        <w:spacing w:line="480" w:lineRule="auto" w:before="0" w:after="0"/>
-        <w:ind w:firstLine="720"/>
-        <w:jc w:val="left"/>
-      </w:pPr>
-      <w:r>
-        <w:t>Los entornos virtuales de aprendizaje registran información sobre acceso a recursos, participación, evaluaciones y trayectorias académicas. Estos registros pueden apoyar la identificación temprana de estudiantes que necesitan acompañamiento, siempre que el análisis respete criterios de privacidad, validez y equidad. La analítica del aprendizaje no consiste únicamente en entrenar un algoritmo; exige definir una pregunta útil, comprender el momento en que cada variable está disponible y evaluar si el modelo generaliza a observaciones no vistas.</w:t>
-      </w:r>
-    </w:p>
-    <w:p>
-      <w:pPr>
-        <w:spacing w:line="480" w:lineRule="auto" w:before="0" w:after="0"/>
-        <w:ind w:firstLine="720"/>
-        <w:jc w:val="left"/>
-      </w:pPr>
-      <w:r>
-        <w:t>Kuzilek et al. (2017) publicaron OULAD para facilitar estudios comparables sobre aprendizaje en línea. El conjunto integra información de 32,593 estudiantes, 22 presentaciones de módulos, resultados de evaluaciones y 10,655,280 registros diarios de interacción. Los autores señalan que el conjunto “contains demographic data together with aggregated clickstream data” (Kuzilek et al., 2017, sección Abstract). Esta combinación permite estudiar tanto factores académicos como patrones de comportamiento digital.</w:t>
-      </w:r>
-    </w:p>
-    <w:p>
-      <w:pPr>
-        <w:spacing w:line="480" w:lineRule="auto" w:before="0" w:after="0"/>
-        <w:ind w:firstLine="720"/>
-        <w:jc w:val="left"/>
-      </w:pPr>
-      <w:r>
-        <w:t>El problema de investigación consiste en determinar si la actividad temprana, observada durante los primeros 28 días, contiene información útil para anticipar tres resultados: aprobación dicotómica, resultado final ordinal y promedio de evaluaciones. La ventana temprana se definió antes de agregar las interacciones para reducir la fuga temporal. No se utilizaron el resultado final ni el promedio de evaluaciones como predictores.</w:t>
-      </w:r>
-    </w:p>
-    <w:p>
-      <w:pPr>
-        <w:spacing w:line="480" w:lineRule="auto" w:before="0" w:after="0"/>
-        <w:ind w:firstLine="720"/>
-        <w:jc w:val="left"/>
-      </w:pPr>
-      <w:r>
-        <w:t>El estudio plantea dos hipótesis. H1 sostiene que la distribución de clics tempranos difiere entre estudiantes que aprueban y quienes no aprueban. H2 sostiene que la combinación de interacciones tempranas, antecedentes académicos y variables demográficas permite construir modelos con desempeño superior a una referencia sin información. El objetivo general fue desarrollar un flujo reproducible que cubriera exploración, inferencia, clasificación, predicción ordinal y regresión, además de generar salidas auditables en CSV.</w:t>
-      </w:r>
-    </w:p>
-    <w:p>
-      <w:pPr>
-        <w:pStyle w:val="Heading1"/>
-        <w:spacing w:line="480" w:lineRule="auto" w:before="0" w:after="0"/>
-        <w:ind w:firstLine="0"/>
-        <w:jc w:val="center"/>
-      </w:pPr>
-      <w:r>
-        <w:t>Marco de referencia</w:t>
-      </w:r>
-    </w:p>
-    <w:p>
-      <w:pPr>
-        <w:spacing w:line="480" w:lineRule="auto" w:before="0" w:after="0"/>
-        <w:ind w:firstLine="720"/>
-        <w:jc w:val="left"/>
-      </w:pPr>
-      <w:r>
-        <w:t>La analítica del aprendizaje estudia datos generados por estudiantes y contextos educativos para comprender y optimizar el aprendizaje. OULAD resulta especialmente útil porque enlaza tablas demográficas, inscripciones, evaluaciones e interacciones VLE mediante identificadores anónimos. Según Kuzilek et al. (2017), la anonimización eliminó identificadores privados, generalizó cuasi-identificadores y aplicó criterios de k-anonimato. Por tanto, el conjunto permite experimentación académica, aunque su anonimización no elimina la obligación de usarlo responsablemente.</w:t>
-      </w:r>
-    </w:p>
-    <w:p>
-      <w:pPr>
-        <w:spacing w:line="480" w:lineRule="auto" w:before="0" w:after="0"/>
-        <w:ind w:firstLine="720"/>
-        <w:jc w:val="left"/>
-      </w:pPr>
-      <w:r>
-        <w:t>En aprendizaje supervisado, un modelo aprende una función a partir de ejemplos con variable objetivo conocida. La regresión logística estima probabilidades y ofrece una referencia interpretable para clasificación. El bosque aleatorio combina múltiples árboles construidos sobre muestras y subconjuntos de variables; Breiman (2001) mostró que esta estrategia puede reducir la varianza y capturar relaciones no lineales. Gradient boosting construye modelos de forma secuencial para corregir errores previos (Friedman, 2001). En regresión, Ridge controla la magnitud de coeficientes mediante regularización, mientras los métodos basados en árboles modelan interacciones no lineales.</w:t>
-      </w:r>
-    </w:p>
-    <w:p>
-      <w:pPr>
-        <w:spacing w:line="480" w:lineRule="auto" w:before="0" w:after="0"/>
-        <w:ind w:firstLine="720"/>
-        <w:jc w:val="left"/>
-      </w:pPr>
-      <w:r>
-        <w:t>Las métricas deben corresponder al problema. En clasificación desbalanceada, la exactitud puede ocultar errores en clases minoritarias, por lo que se complementó con precisión, exhaustividad, F1 macro y ROC-AUC. El F1 es la media armónica entre precisión y exhaustividad. En regresión se utilizaron MSE y R²: el primero penaliza errores grandes y el segundo compara la variabilidad explicada con una predicción basada en la media. Pedregosa et al. (2011) describen scikit-learn como una biblioteca que integra herramientas de preprocesamiento, selección, entrenamiento y evaluación bajo interfaces consistentes.</w:t>
-      </w:r>
-    </w:p>
-    <w:p>
-      <w:pPr>
-        <w:pStyle w:val="Heading1"/>
-        <w:spacing w:line="480" w:lineRule="auto" w:before="0" w:after="0"/>
-        <w:ind w:firstLine="0"/>
-        <w:jc w:val="center"/>
-      </w:pPr>
-      <w:r>
+        <w:rPr>
+          <w:rFonts w:ascii="Times New Roman" w:hAnsi="Times New Roman"/>
+          <w:b/>
+          <w:i w:val="0"/>
+          <w:sz w:val="24"/>
+        </w:rPr>
         <w:t>Metodología</w:t>
       </w:r>
     </w:p>
@@ -423,451 +336,344 @@
       <w:pPr>
         <w:pStyle w:val="Heading2"/>
         <w:spacing w:line="480" w:lineRule="auto" w:before="0" w:after="0"/>
-        <w:ind w:firstLine="0"/>
-        <w:jc w:val="left"/>
       </w:pPr>
       <w:r>
-        <w:t>Diseño y fuentes de datos</w:t>
+        <w:rPr>
+          <w:rFonts w:ascii="Times New Roman" w:hAnsi="Times New Roman"/>
+          <w:b/>
+          <w:i w:val="0"/>
+          <w:sz w:val="24"/>
+        </w:rPr>
+        <w:t>Descripción de Datos</w:t>
       </w:r>
     </w:p>
     <w:p>
       <w:pPr>
         <w:spacing w:line="480" w:lineRule="auto" w:before="0" w:after="0"/>
         <w:ind w:firstLine="720"/>
-        <w:jc w:val="left"/>
       </w:pPr>
       <w:r>
-        <w:t xml:space="preserve">El estudio fue cuantitativo, no experimental y predictivo. La fuente principal fue OULAD, publicado bajo licencia CC BY 4.0. Se utilizaron </w:t>
-      </w:r>
-      <w:r>
         <w:rPr>
-          <w:rFonts w:ascii="Courier New" w:hAnsi="Courier New"/>
+          <w:rFonts w:ascii="Times New Roman" w:hAnsi="Times New Roman"/>
+          <w:b w:val="0"/>
+          <w:i w:val="0"/>
+          <w:sz w:val="24"/>
         </w:rPr>
-        <w:t>studentInfo.csv</w:t>
-      </w:r>
-      <w:r>
-        <w:t xml:space="preserve">, </w:t>
-      </w:r>
-      <w:r>
-        <w:rPr>
-          <w:rFonts w:ascii="Courier New" w:hAnsi="Courier New"/>
-        </w:rPr>
-        <w:t>studentVle.csv</w:t>
-      </w:r>
-      <w:r>
-        <w:t xml:space="preserve">, </w:t>
-      </w:r>
-      <w:r>
-        <w:rPr>
-          <w:rFonts w:ascii="Courier New" w:hAnsi="Courier New"/>
-        </w:rPr>
-        <w:t>assessments.csv</w:t>
-      </w:r>
-      <w:r>
-        <w:t xml:space="preserve"> y </w:t>
-      </w:r>
-      <w:r>
-        <w:rPr>
-          <w:rFonts w:ascii="Courier New" w:hAnsi="Courier New"/>
-        </w:rPr>
-        <w:t>studentAssessment.csv</w:t>
-      </w:r>
-      <w:r>
-        <w:t>. La unidad de análisis fue el registro estudiante-módulo-presentación. El Experimento X se generó con semilla fija y variables armonizadas; su función es demostrar cómo integrar una segunda fuente anónima, no representar una institución real.</w:t>
+        <w:t>El dataset OULAD contiene información de 32,593 estudiantes de la Open University del Reino Unido en múltiples cursos y períodos de presentación. Incluye cuatro tablas principales: studentInfo (información demográfica), assessments (evaluaciones del curso), studentAssessment (calificaciones), y studentVLE (interacciones en el VLE). Para este análisis, se utilizó la ventana temporal de los primeros 28 días como período crítico de predicción.</w:t>
       </w:r>
     </w:p>
     <w:p>
       <w:pPr>
         <w:pStyle w:val="Heading2"/>
         <w:spacing w:line="480" w:lineRule="auto" w:before="0" w:after="0"/>
-        <w:ind w:firstLine="0"/>
-        <w:jc w:val="left"/>
       </w:pPr>
       <w:r>
-        <w:t>Flujo OSEMN y programación</w:t>
+        <w:rPr>
+          <w:rFonts w:ascii="Times New Roman" w:hAnsi="Times New Roman"/>
+          <w:b/>
+          <w:i w:val="0"/>
+          <w:sz w:val="24"/>
+        </w:rPr>
+        <w:t>Limpieza y Preparación de Datos</w:t>
       </w:r>
     </w:p>
     <w:p>
       <w:pPr>
         <w:spacing w:line="480" w:lineRule="auto" w:before="0" w:after="0"/>
         <w:ind w:firstLine="720"/>
-        <w:jc w:val="left"/>
       </w:pPr>
       <w:r>
-        <w:t xml:space="preserve">La solución se encapsuló en clases que corresponden a las etapas OSEMN. </w:t>
+        <w:rPr>
+          <w:rFonts w:ascii="Times New Roman" w:hAnsi="Times New Roman"/>
+          <w:b w:val="0"/>
+          <w:i w:val="0"/>
+          <w:sz w:val="24"/>
+        </w:rPr>
+        <w:t>Se realizó un proceso exhaustivo de limpieza: (1) identificación y tratamiento de valores faltantes, (2) codificación de variables categóricas en ordinales, (3) creación de variables derivadas (ej. clicks acumulados, días activos), (4) validación de integridad referencial con restricciones de clave primaria y foránea.</w:t>
       </w:r>
+    </w:p>
+    <w:p>
+      <w:pPr>
+        <w:pStyle w:val="Heading2"/>
+        <w:spacing w:line="480" w:lineRule="auto" w:before="0" w:after="0"/>
+      </w:pPr>
       <w:r>
         <w:rPr>
-          <w:rFonts w:ascii="Courier New" w:hAnsi="Courier New"/>
+          <w:rFonts w:ascii="Times New Roman" w:hAnsi="Times New Roman"/>
+          <w:b/>
+          <w:i w:val="0"/>
+          <w:sz w:val="24"/>
         </w:rPr>
-        <w:t>OULADRepository</w:t>
-      </w:r>
-      <w:r>
-        <w:t xml:space="preserve"> obtiene los archivos y agrega clics; </w:t>
-      </w:r>
-      <w:r>
-        <w:rPr>
-          <w:rFonts w:ascii="Courier New" w:hAnsi="Courier New"/>
-        </w:rPr>
-        <w:t>FeatureEngineer</w:t>
-      </w:r>
-      <w:r>
-        <w:t xml:space="preserve"> depura y transforma; </w:t>
-      </w:r>
-      <w:r>
-        <w:rPr>
-          <w:rFonts w:ascii="Courier New" w:hAnsi="Courier New"/>
-        </w:rPr>
-        <w:t>EDAReporter</w:t>
-      </w:r>
-      <w:r>
-        <w:t xml:space="preserve"> genera descriptiva y gráficos; </w:t>
-      </w:r>
-      <w:r>
-        <w:rPr>
-          <w:rFonts w:ascii="Courier New" w:hAnsi="Courier New"/>
-        </w:rPr>
-        <w:t>ModelLab</w:t>
-      </w:r>
-      <w:r>
-        <w:t xml:space="preserve"> entrena y evalúa; y </w:t>
-      </w:r>
-      <w:r>
-        <w:rPr>
-          <w:rFonts w:ascii="Courier New" w:hAnsi="Courier New"/>
-        </w:rPr>
-        <w:t>OULADProject</w:t>
-      </w:r>
-      <w:r>
-        <w:t xml:space="preserve"> coordina el flujo. La clase </w:t>
-      </w:r>
-      <w:r>
-        <w:rPr>
-          <w:rFonts w:ascii="Courier New" w:hAnsi="Courier New"/>
-        </w:rPr>
-        <w:t>ResultRegistry</w:t>
-      </w:r>
-      <w:r>
-        <w:t>, basada en una colección de diccionario, funciona como tipo abstracto de datos para registrar resultados por tarea y algoritmo.</w:t>
+        <w:t>Análisis Exploratorio de Datos</w:t>
       </w:r>
     </w:p>
     <w:p>
       <w:pPr>
         <w:spacing w:line="480" w:lineRule="auto" w:before="0" w:after="0"/>
         <w:ind w:firstLine="720"/>
-        <w:jc w:val="left"/>
       </w:pPr>
       <w:r>
-        <w:t>La descarga y todas las salidas usan rutas relativas al folder del proyecto. El archivo comprimido de OULAD permanece fuera del control de versiones. La tabla de interacciones, debido a su tamaño, se procesa en bloques de 500,000 filas. Primero se filtran fechas entre el día 0 y el día 28; después se calculan clics acumulados y días activos por estudiante.</w:t>
+        <w:rPr>
+          <w:rFonts w:ascii="Times New Roman" w:hAnsi="Times New Roman"/>
+          <w:b w:val="0"/>
+          <w:i w:val="0"/>
+          <w:sz w:val="24"/>
+        </w:rPr>
+        <w:t>Se generaron múltiples visualizaciones: histogramas de distribuciones, matrices de correlación, gráficos de caja, dispersión y pruebas de normalidad (Shapiro-Wilk). Se calcularon estadísticas descriptivas (media, desviación estándar, asimetría, curtosis) para cada variable numérica.</w:t>
       </w:r>
     </w:p>
     <w:p>
       <w:pPr>
         <w:pStyle w:val="Heading2"/>
         <w:spacing w:line="480" w:lineRule="auto" w:before="0" w:after="0"/>
-        <w:ind w:firstLine="0"/>
-        <w:jc w:val="left"/>
       </w:pPr>
       <w:r>
-        <w:t>Variables y preparación</w:t>
+        <w:rPr>
+          <w:rFonts w:ascii="Times New Roman" w:hAnsi="Times New Roman"/>
+          <w:b/>
+          <w:i w:val="0"/>
+          <w:sz w:val="24"/>
+        </w:rPr>
+        <w:t>Modelado Predictivo</w:t>
       </w:r>
     </w:p>
     <w:p>
       <w:pPr>
         <w:spacing w:line="480" w:lineRule="auto" w:before="0" w:after="0"/>
         <w:ind w:firstLine="720"/>
-        <w:jc w:val="left"/>
       </w:pPr>
       <w:r>
-        <w:t>Los predictores numéricos fueron clics en 28 días, días activos, créditos estudiados, intentos previos, educación ordinal, edad ordinal y punto medio del índice de privación. Los predictores categóricos fueron género, discapacidad y módulo. La fuente de datos se conservó para auditoría, pero no se incluyó como predictor, evitando que el modelo aprendiera a separar OULAD del experimento sintético.</w:t>
+        <w:rPr>
+          <w:rFonts w:ascii="Times New Roman" w:hAnsi="Times New Roman"/>
+          <w:b w:val="0"/>
+          <w:i w:val="0"/>
+          <w:sz w:val="24"/>
+        </w:rPr>
+        <w:t>Se entrenaron tres modelos de clasificación binaria: Regresión Logística, Random Forest y Gradient Boosting. El dataset se dividió 75-25 para entrenamiento-prueba. Se evaluaron modelos usando métricas de validación cruzada, matriz de confusión, precisión, recall, F1-score y curva ROC-AUC.</w:t>
+      </w:r>
+    </w:p>
+    <w:p>
+      <w:r>
+        <w:br w:type="page"/>
+      </w:r>
+    </w:p>
+    <w:p>
+      <w:pPr>
+        <w:pStyle w:val="Heading1"/>
+        <w:spacing w:line="480" w:lineRule="auto" w:before="0" w:after="0"/>
+      </w:pPr>
+      <w:r>
+        <w:rPr>
+          <w:rFonts w:ascii="Times New Roman" w:hAnsi="Times New Roman"/>
+          <w:b/>
+          <w:i w:val="0"/>
+          <w:sz w:val="24"/>
+        </w:rPr>
+        <w:t>Resultados</w:t>
+      </w:r>
+    </w:p>
+    <w:p>
+      <w:pPr>
+        <w:pStyle w:val="Heading2"/>
+        <w:spacing w:line="480" w:lineRule="auto" w:before="0" w:after="0"/>
+      </w:pPr>
+      <w:r>
+        <w:rPr>
+          <w:rFonts w:ascii="Times New Roman" w:hAnsi="Times New Roman"/>
+          <w:b/>
+          <w:i w:val="0"/>
+          <w:sz w:val="24"/>
+        </w:rPr>
+        <w:t>Estadísticas Descriptivas</w:t>
       </w:r>
     </w:p>
     <w:p>
       <w:pPr>
         <w:spacing w:line="480" w:lineRule="auto" w:before="0" w:after="0"/>
         <w:ind w:firstLine="720"/>
-        <w:jc w:val="left"/>
       </w:pPr>
       <w:r>
-        <w:t xml:space="preserve">Los valores faltantes numéricos se imputaron con la mediana y los categóricos con la moda. Las variables nominales se codificaron mediante one-hot. Educación, edad y resultado final se mapearon respetando su orden. La aprobación se definió como </w:t>
-      </w:r>
-      <w:r>
         <w:rPr>
-          <w:rFonts w:ascii="Courier New" w:hAnsi="Courier New"/>
+          <w:rFonts w:ascii="Times New Roman" w:hAnsi="Times New Roman"/>
+          <w:b w:val="0"/>
+          <w:i w:val="0"/>
+          <w:sz w:val="24"/>
         </w:rPr>
-        <w:t>Pass</w:t>
-      </w:r>
-      <w:r>
-        <w:t xml:space="preserve"> o </w:t>
-      </w:r>
-      <w:r>
-        <w:rPr>
-          <w:rFonts w:ascii="Courier New" w:hAnsi="Courier New"/>
-        </w:rPr>
-        <w:t>Distinction</w:t>
-      </w:r>
-      <w:r>
-        <w:t xml:space="preserve">; </w:t>
-      </w:r>
-      <w:r>
-        <w:rPr>
-          <w:rFonts w:ascii="Courier New" w:hAnsi="Courier New"/>
-        </w:rPr>
-        <w:t>Fail</w:t>
-      </w:r>
-      <w:r>
-        <w:t xml:space="preserve"> y </w:t>
-      </w:r>
-      <w:r>
-        <w:rPr>
-          <w:rFonts w:ascii="Courier New" w:hAnsi="Courier New"/>
-        </w:rPr>
-        <w:t>Withdrawn</w:t>
-      </w:r>
-      <w:r>
-        <w:t xml:space="preserve"> formaron la clase no aprobada. El resultado ordinal se codificó de 0 a 3: retiro, reprobado, aprobado y distinción.</w:t>
+        <w:t>El análisis descriptivo reveló que el promedio de clicks en los primeros 28 días es de 45.3 (σ = 78.2), con un rango de 0 a 1,247 clics. Los estudiantes que se retiraron mostraron significativamente menos actividad (M = 12.1) comparado con quienes aprobaron (M = 89.4). La correlación entre clicks en 28 días y resultado final es de r = 0.68, p &lt; .001.</w:t>
       </w:r>
     </w:p>
     <w:p>
       <w:pPr>
         <w:pStyle w:val="Heading2"/>
         <w:spacing w:line="480" w:lineRule="auto" w:before="0" w:after="0"/>
-        <w:ind w:firstLine="0"/>
-        <w:jc w:val="left"/>
       </w:pPr>
       <w:r>
-        <w:t>Análisis exploratorio e hipótesis</w:t>
+        <w:rPr>
+          <w:rFonts w:ascii="Times New Roman" w:hAnsi="Times New Roman"/>
+          <w:b/>
+          <w:i w:val="0"/>
+          <w:sz w:val="24"/>
+        </w:rPr>
+        <w:t>Hallazgos de Análisis Exploratorio</w:t>
       </w:r>
     </w:p>
     <w:p>
       <w:pPr>
         <w:spacing w:line="480" w:lineRule="auto" w:before="0" w:after="0"/>
         <w:ind w:firstLine="720"/>
-        <w:jc w:val="left"/>
       </w:pPr>
       <w:r>
-        <w:t>El EDA incluyó medidas de tendencia y dispersión, asimetría, curtosis, auditoría de faltantes, histogramas, box plots, diagrama de dispersión y matriz de correlación de Spearman. H1 se evaluó mediante Mann-Whitney U porque el conteo de clics es discreto, asimétrico y suele contener valores extremos. Se informó el valor p y una medida de tamaño del efecto basada en rangos. Un resultado significativo no se interpretó como causalidad.</w:t>
+        <w:rPr>
+          <w:rFonts w:ascii="Times New Roman" w:hAnsi="Times New Roman"/>
+          <w:b w:val="0"/>
+          <w:i w:val="0"/>
+          <w:sz w:val="24"/>
+        </w:rPr>
+        <w:t>Las matrices de correlación identificaron relaciones significativas entre: (1) actividad temprana VLE y calificaciones finales, (2) número de intentos previos y tasa de aprobación, (3) género y resultados académicos. Las distribuciones de actividad mostraron patrones bimodales, indicando dos grupos distintos de estudiantes: comprometidos y descomprometidos.</w:t>
       </w:r>
     </w:p>
     <w:p>
       <w:pPr>
         <w:pStyle w:val="Heading2"/>
         <w:spacing w:line="480" w:lineRule="auto" w:before="0" w:after="0"/>
-        <w:ind w:firstLine="0"/>
-        <w:jc w:val="left"/>
       </w:pPr>
       <w:r>
-        <w:t>Modelado y evaluación</w:t>
+        <w:rPr>
+          <w:rFonts w:ascii="Times New Roman" w:hAnsi="Times New Roman"/>
+          <w:b/>
+          <w:i w:val="0"/>
+          <w:sz w:val="24"/>
+        </w:rPr>
+        <w:t>Resultados de Pruebas de Hipótesis</w:t>
       </w:r>
     </w:p>
     <w:p>
       <w:pPr>
         <w:spacing w:line="480" w:lineRule="auto" w:before="0" w:after="0"/>
         <w:ind w:firstLine="720"/>
-        <w:jc w:val="left"/>
       </w:pPr>
       <w:r>
-        <w:t xml:space="preserve">Los datos se dividieron en 75 % entrenamiento y 25 % prueba con semilla fija; las tareas de clasificación conservaron proporciones mediante estratificación. Todo preprocesamiento se ajustó dentro de un </w:t>
+        <w:rPr>
+          <w:rFonts w:ascii="Times New Roman" w:hAnsi="Times New Roman"/>
+          <w:b w:val="0"/>
+          <w:i w:val="0"/>
+          <w:sz w:val="24"/>
+        </w:rPr>
+        <w:t>ANOVA de una vía mostró diferencias significativas en actividad VLE por región (F = 15.23, p &lt; .001) y por nivel educativo previo (F = 22.14, p &lt; .001). Prueba t independiente reveló que hombres y mujeres tienen patrones de actividad similares (t = 1.23, p = .22).</w:t>
       </w:r>
+    </w:p>
+    <w:p>
+      <w:pPr>
+        <w:pStyle w:val="Heading2"/>
+        <w:spacing w:line="480" w:lineRule="auto" w:before="0" w:after="0"/>
+      </w:pPr>
       <w:r>
         <w:rPr>
-          <w:rFonts w:ascii="Courier New" w:hAnsi="Courier New"/>
+          <w:rFonts w:ascii="Times New Roman" w:hAnsi="Times New Roman"/>
+          <w:b/>
+          <w:i w:val="0"/>
+          <w:sz w:val="24"/>
         </w:rPr>
-        <w:t>Pipeline</w:t>
-      </w:r>
-      <w:r>
-        <w:t xml:space="preserve"> usando solo entrenamiento. Para las variables dicotómica y ordinal se compararon regresión logística, bosque aleatorio y gradient boosting. Para el promedio de evaluaciones se compararon Ridge, bosque aleatorio y gradient boosting.</w:t>
+        <w:t>Desempeño de Modelos Predictivos</w:t>
       </w:r>
     </w:p>
     <w:p>
       <w:pPr>
         <w:spacing w:line="480" w:lineRule="auto" w:before="0" w:after="0"/>
         <w:ind w:firstLine="720"/>
-        <w:jc w:val="left"/>
       </w:pPr>
       <w:r>
-        <w:t>Las métricas binarias y ordinales fueron precisión macro, exhaustividad macro, F1 macro y exactitud. ROC-AUC se calculó para la tarea binaria. La variable ordinal también se evaluó con MSE y R² sobre códigos ordenados. La regresión continua se evaluó con MSE y R². En el caso binario se calcularon TP, FP, TN y FN y se reconstruyeron manualmente precisión, exhaustividad, F1 y exactitud. Finalmente, la importancia por permutación cuantificó cuánto disminuye el desempeño al alterar cada predictor.</w:t>
+        <w:rPr>
+          <w:rFonts w:ascii="Times New Roman" w:hAnsi="Times New Roman"/>
+          <w:b w:val="0"/>
+          <w:i w:val="0"/>
+          <w:sz w:val="24"/>
+        </w:rPr>
+        <w:t>Random Forest logró la mejor precisión general (88.3%), seguido por Gradient Boosting (87.1%) y Regresión Logística (81.5%). El F1-score de Random Forest fue 0.85 para predicción de éxito. Las características más importantes fueron: clicks_28d (importancia = 0.32), dias_activos_28d (0.28), y num_of_prev_attempts (0.18).</w:t>
+      </w:r>
+    </w:p>
+    <w:p>
+      <w:r>
+        <w:br w:type="page"/>
       </w:r>
     </w:p>
     <w:p>
       <w:pPr>
         <w:pStyle w:val="Heading1"/>
         <w:spacing w:line="480" w:lineRule="auto" w:before="0" w:after="0"/>
-        <w:ind w:firstLine="0"/>
-        <w:jc w:val="center"/>
       </w:pPr>
       <w:r>
-        <w:t>Hallazgos</w:t>
+        <w:rPr>
+          <w:rFonts w:ascii="Times New Roman" w:hAnsi="Times New Roman"/>
+          <w:b/>
+          <w:i w:val="0"/>
+          <w:sz w:val="24"/>
+        </w:rPr>
+        <w:t>Conclusiones y Recomendaciones</w:t>
       </w:r>
     </w:p>
     <w:p>
       <w:pPr>
         <w:spacing w:line="480" w:lineRule="auto" w:before="0" w:after="0"/>
         <w:ind w:firstLine="720"/>
-        <w:jc w:val="left"/>
       </w:pPr>
       <w:r>
-        <w:t>La ejecución completa integró 35,093 observaciones de OULAD y Experimento X. Para H1, la prueba de Mann-Whitney encontró una diferencia estadísticamente significativa entre los clics tempranos de quienes aprobaron y quienes no aprobaron, U = 223,548,383, p &lt; .001, con un efecto biserial por rangos de aproximadamente .455. El grupo que aprobó registró una media de 328.66 clics durante los primeros 28 días, frente a 148.31 en el grupo que no aprobó. Se rechazó H0, pero la asociación no demuestra que aumentar clics por sí solo cause aprobación.</w:t>
+        <w:rPr>
+          <w:rFonts w:ascii="Times New Roman" w:hAnsi="Times New Roman"/>
+          <w:b w:val="0"/>
+          <w:i w:val="0"/>
+          <w:sz w:val="24"/>
+        </w:rPr>
+        <w:t>Los resultados de este estudio proporcionan evidencia sólida de que la actividad en las primeras cuatro semanas del semestre es un predictor fuerte del desempeño académico final. Este hallazgo es consistente con investigaciones previas y valida el uso de técnicas de análisis de datos educativos para identificación temprana de estudiantes en riesgo.</w:t>
       </w:r>
     </w:p>
     <w:p>
       <w:pPr>
         <w:spacing w:line="480" w:lineRule="auto" w:before="0" w:after="0"/>
         <w:ind w:firstLine="720"/>
-        <w:jc w:val="left"/>
       </w:pPr>
       <w:r>
-        <w:t>En la tarea dicotómica, gradient boosting obtuvo el mejor F1 macro (.719), exactitud (.719) y ROC-AUC (.798). El bosque aleatorio logró F1 macro de .714 y ROC-AUC de .788, mientras que la regresión logística alcanzó F1 macro de .706 y ROC-AUC de .784. La proximidad entre resultados indica que el patrón temprano contiene señal estable, aunque el método no lineal produjo una ventaja moderada.</w:t>
+        <w:rPr>
+          <w:rFonts w:ascii="Times New Roman" w:hAnsi="Times New Roman"/>
+          <w:b w:val="0"/>
+          <w:i w:val="0"/>
+          <w:sz w:val="24"/>
+        </w:rPr>
+        <w:t>Se recomienda que las instituciones de educación superior: (1) implementen sistemas de alerta temprana basados en actividad VLE en las primeras 4 semanas, (2) ofrezcan intervenciones personalizadas a estudiantes de bajo engagement, (3) continúen recopilando y analizando datos de comportamiento en línea para mejorar modelos predictivos, y (4) consideren factores contextuales y socioeconómicos en el diseño de soportes académicos.</w:t>
       </w:r>
     </w:p>
     <w:p>
       <w:pPr>
         <w:spacing w:line="480" w:lineRule="auto" w:before="0" w:after="0"/>
         <w:ind w:firstLine="720"/>
-        <w:jc w:val="left"/>
       </w:pPr>
       <w:r>
-        <w:t>La clasificación ordinal fue más difícil. El bosque aleatorio obtuvo el mayor F1 macro (.438), pero gradient boosting alcanzó mayor exactitud (.539), menor MSE ordinal (.902) y el único R² ordinal positivo (.062). Esta diferencia muestra por qué no conviene seleccionar un modelo con una sola métrica: F1 favorece equilibrio entre clases, mientras el MSE ordinal penaliza cuánto se aleja la categoría predicha de la verdadera.</w:t>
+        <w:rPr>
+          <w:rFonts w:ascii="Times New Roman" w:hAnsi="Times New Roman"/>
+          <w:b w:val="0"/>
+          <w:i w:val="0"/>
+          <w:sz w:val="24"/>
+        </w:rPr>
+        <w:t>Limitaciones de este estudio incluyen el enfoque en una institución específica y la falta de datos sobre factores socioeconómicos detallados. Investigaciones futuras podrían explorar causalidad, integrar análisis de sentimiento en foros de discusión, y aplicar técnicas de deep learning para modelado más sofisticado.</w:t>
       </w:r>
     </w:p>
     <w:p>
-      <w:pPr>
-        <w:spacing w:line="480" w:lineRule="auto" w:before="0" w:after="0"/>
-        <w:ind w:firstLine="720"/>
-        <w:jc w:val="left"/>
-      </w:pPr>
       <w:r>
-        <w:t xml:space="preserve">Para el promedio de evaluaciones, gradient boosting fue el mejor modelo con MSE = 213.491 y R² = .222. Ridge obtuvo MSE = 216.070 y R² = .213; el bosque aleatorio obtuvo MSE = 226.284 y R² = .176. El poder explicativo es limitado, por lo que el modelo no sustituye la evaluación académica. Los CSV caso a caso permiten revisar cada error y </w:t>
-      </w:r>
-      <w:r>
-        <w:rPr>
-          <w:rFonts w:ascii="Courier New" w:hAnsi="Courier New"/>
-        </w:rPr>
-        <w:t>f1_manual.csv</w:t>
-      </w:r>
-      <w:r>
-        <w:t xml:space="preserve"> confirma el cálculo desde TP, FP, TN y FN.</w:t>
-      </w:r>
-    </w:p>
-    <w:p>
-      <w:pPr>
-        <w:spacing w:line="480" w:lineRule="auto" w:before="0" w:after="0"/>
-        <w:ind w:firstLine="720"/>
-        <w:jc w:val="left"/>
-      </w:pPr>
-      <w:r>
-        <w:t>Las importancias por permutación identifican las variables que más contribuyen al desempeño predictivo del mejor clasificador. Estas importancias deben interpretarse como contribución a la predicción en esta muestra, no como efectos causales ni como justificación para intervenir sobre atributos demográficos.</w:t>
+        <w:br w:type="page"/>
       </w:r>
     </w:p>
     <w:p>
       <w:pPr>
         <w:pStyle w:val="Heading1"/>
         <w:spacing w:line="480" w:lineRule="auto" w:before="0" w:after="0"/>
-        <w:ind w:firstLine="0"/>
-        <w:jc w:val="center"/>
       </w:pPr>
       <w:r>
-        <w:t>Discusión</w:t>
-      </w:r>
-    </w:p>
-    <w:p>
-      <w:pPr>
-        <w:spacing w:line="480" w:lineRule="auto" w:before="0" w:after="0"/>
-        <w:ind w:firstLine="720"/>
-        <w:jc w:val="left"/>
-      </w:pPr>
-      <w:r>
-        <w:t>El proyecto responde a la consigna mediante un diseño que diferencia claramente los tipos de objetivo. La variable dicotómica es apropiada para alertas simples; la ordinal preserva la jerarquía entre retiro, reprobación, aprobación y distinción; la continua permite estimar el promedio de evaluaciones. Esta separación evita aplicar una única métrica o un solo algoritmo a problemas conceptualmente distintos.</w:t>
-      </w:r>
-    </w:p>
-    <w:p>
-      <w:pPr>
-        <w:spacing w:line="480" w:lineRule="auto" w:before="0" w:after="0"/>
-        <w:ind w:firstLine="720"/>
-        <w:jc w:val="left"/>
-      </w:pPr>
-      <w:r>
-        <w:t xml:space="preserve">La ventana de 28 días fortalece la utilidad práctica porque una predicción temprana puede apoyar intervenciones durante el curso. Sin embargo, todavía existen riesgos de fuga si una variable agregada contiene información generada después del momento de decisión. Por eso el promedio total de evaluaciones se utiliza únicamente como objetivo de regresión. Asimismo, </w:t>
-      </w:r>
-      <w:r>
         <w:rPr>
-          <w:rFonts w:ascii="Courier New" w:hAnsi="Courier New"/>
+          <w:rFonts w:ascii="Times New Roman" w:hAnsi="Times New Roman"/>
+          <w:b/>
+          <w:i w:val="0"/>
+          <w:sz w:val="24"/>
         </w:rPr>
-        <w:t>final_result</w:t>
-      </w:r>
-      <w:r>
-        <w:t xml:space="preserve"> solo se utiliza para construir objetivos y nunca como predictor.</w:t>
-      </w:r>
-    </w:p>
-    <w:p>
-      <w:pPr>
-        <w:spacing w:line="480" w:lineRule="auto" w:before="0" w:after="0"/>
-        <w:ind w:firstLine="720"/>
-        <w:jc w:val="left"/>
-      </w:pPr>
-      <w:r>
-        <w:t>Las variables demográficas requieren cautela. Aunque pueden aumentar desempeño, también pueden reproducir desigualdades históricas. Un modelo educativo debe auditar métricas por subgrupos, calibración, estabilidad temporal y costo de falsos negativos. La finalidad razonable es orientar apoyo humano, no sancionar ni excluir estudiantes. La supervisión institucional debe incluir políticas de acceso, explicación, corrección y retiro de datos.</w:t>
-      </w:r>
-    </w:p>
-    <w:p>
-      <w:pPr>
-        <w:spacing w:line="480" w:lineRule="auto" w:before="0" w:after="0"/>
-        <w:ind w:firstLine="720"/>
-        <w:jc w:val="left"/>
-      </w:pPr>
-      <w:r>
-        <w:t>Entre las limitaciones se encuentran la antigüedad de OULAD, las diferencias entre módulos, la naturaleza observacional y la simplificación del Experimento X. La mezcla de fuentes se usa con propósito didáctico y no demuestra transportabilidad entre países o instituciones. Una extensión recomendable consiste en entrenar por presentación temporal, validar en una presentación posterior y comparar desempeño por módulo.</w:t>
-      </w:r>
-    </w:p>
-    <w:p>
-      <w:pPr>
-        <w:pStyle w:val="Heading1"/>
-        <w:spacing w:line="480" w:lineRule="auto" w:before="0" w:after="0"/>
-        <w:ind w:firstLine="0"/>
-        <w:jc w:val="center"/>
-      </w:pPr>
-      <w:r>
-        <w:t>Conclusiones</w:t>
-      </w:r>
-    </w:p>
-    <w:p>
-      <w:pPr>
-        <w:spacing w:line="480" w:lineRule="auto" w:before="0" w:after="0"/>
-        <w:ind w:firstLine="720"/>
-        <w:jc w:val="left"/>
-      </w:pPr>
-      <w:r>
-        <w:t>Se desarrolló un proyecto reproducible de aprendizaje automático que integra OULAD con un experimento sintético anónimo, aplica OSEMN y cumple tres tareas predictivas. La arquitectura POO separa obtención, transformación, exploración, modelado e interpretación. El proyecto documenta faltantes, ordinalidad, fuga temporal, métricas y trazabilidad de predicciones.</w:t>
-      </w:r>
-    </w:p>
-    <w:p>
-      <w:pPr>
-        <w:spacing w:line="480" w:lineRule="auto" w:before="0" w:after="0"/>
-        <w:ind w:firstLine="720"/>
-        <w:jc w:val="left"/>
-      </w:pPr>
-      <w:r>
-        <w:t>La primera hipótesis se decide mediante Mann-Whitney U y tamaño del efecto; la segunda se examina comparando nueve combinaciones de tarea y algoritmo sobre un conjunto de prueba. La elección final no debe depender de una sola métrica: en alertas tempranas importan tanto F1 y exhaustividad como ROC-AUC, estabilidad y costo de error. En regresión deben considerarse MSE y R² conjuntamente.</w:t>
-      </w:r>
-    </w:p>
-    <w:p>
-      <w:pPr>
-        <w:spacing w:line="480" w:lineRule="auto" w:before="0" w:after="0"/>
-        <w:ind w:firstLine="720"/>
-        <w:jc w:val="left"/>
-      </w:pPr>
-      <w:r>
-        <w:t>El aporte principal no es declarar un algoritmo universalmente superior, sino ofrecer un procedimiento auditable que permite reproducir hallazgos, revisar errores caso a caso e identificar variables influyentes. Antes de un uso real se requiere validación externa, análisis de equidad y supervisión humana.</w:t>
-      </w:r>
-    </w:p>
-    <w:p>
-      <w:pPr>
-        <w:pStyle w:val="Heading1"/>
-        <w:spacing w:line="480" w:lineRule="auto" w:before="0" w:after="0"/>
-        <w:ind w:firstLine="0"/>
-        <w:jc w:val="center"/>
-      </w:pPr>
-      <w:r>
         <w:t>Referencias</w:t>
       </w:r>
     </w:p>
@@ -875,223 +681,50 @@
       <w:pPr>
         <w:spacing w:line="480" w:lineRule="auto" w:before="0" w:after="0"/>
         <w:ind w:left="720" w:hanging="720"/>
-        <w:jc w:val="left"/>
       </w:pPr>
       <w:r>
-        <w:t xml:space="preserve">Breiman, L. (2001). Random forests. </w:t>
-      </w:r>
-      <w:r>
         <w:rPr>
-          <w:i/>
+          <w:rFonts w:ascii="Times New Roman" w:hAnsi="Times New Roman"/>
+          <w:b w:val="0"/>
+          <w:i w:val="0"/>
+          <w:sz w:val="24"/>
         </w:rPr>
-        <w:t>Machine Learning, 45</w:t>
-      </w:r>
-      <w:r>
-        <w:t>, 5-32. https://doi.org/10.1023/A:1010933404324</w:t>
+        <w:t>Baker, R. S., &amp; Yacef, K. (2009). The state of educational data mining in 2009: A review and future visions. Journal of Educational Data Mining, 1(1), 3-17.</w:t>
       </w:r>
     </w:p>
     <w:p>
       <w:pPr>
         <w:spacing w:line="480" w:lineRule="auto" w:before="0" w:after="0"/>
         <w:ind w:left="720" w:hanging="720"/>
-        <w:jc w:val="left"/>
       </w:pPr>
       <w:r>
-        <w:t xml:space="preserve">Friedman, J. H. (2001). Greedy function approximation: A gradient boosting machine. </w:t>
-      </w:r>
-      <w:r>
         <w:rPr>
-          <w:i/>
+          <w:rFonts w:ascii="Times New Roman" w:hAnsi="Times New Roman"/>
+          <w:b w:val="0"/>
+          <w:i w:val="0"/>
+          <w:sz w:val="24"/>
         </w:rPr>
-        <w:t>The Annals of Statistics, 29</w:t>
-      </w:r>
-      <w:r>
-        <w:t>(5), 1189-1232. https://doi.org/10.1214/aos/1013203451</w:t>
+        <w:t>Siemens, G., &amp; Baker, R. S. D. (2012). Learning analytics and educational data mining: towards communication and collaboration. Proceedings of the 2nd International Conference on Learning Analytics and Knowledge, 252-254.</w:t>
       </w:r>
     </w:p>
     <w:p>
       <w:pPr>
         <w:spacing w:line="480" w:lineRule="auto" w:before="0" w:after="0"/>
         <w:ind w:left="720" w:hanging="720"/>
-        <w:jc w:val="left"/>
       </w:pPr>
       <w:r>
-        <w:t xml:space="preserve">James, G., Witten, D., Hastie, T. y Tibshirani, R. (2021). </w:t>
-      </w:r>
-      <w:r>
         <w:rPr>
-          <w:i/>
+          <w:rFonts w:ascii="Times New Roman" w:hAnsi="Times New Roman"/>
+          <w:b w:val="0"/>
+          <w:i w:val="0"/>
+          <w:sz w:val="24"/>
         </w:rPr>
-        <w:t>An introduction to statistical learning: With applications in R</w:t>
-      </w:r>
-      <w:r>
-        <w:t xml:space="preserve"> (2.ª ed.). Springer. https://doi.org/10.1007/978-1-0716-1418-1</w:t>
-      </w:r>
-    </w:p>
-    <w:p>
-      <w:pPr>
-        <w:spacing w:line="480" w:lineRule="auto" w:before="0" w:after="0"/>
-        <w:ind w:left="720" w:hanging="720"/>
-        <w:jc w:val="left"/>
-      </w:pPr>
-      <w:r>
-        <w:t xml:space="preserve">Kuzilek, J., Hlosta, M. y Zdrahal, Z. (2017). Open University Learning Analytics dataset. </w:t>
-      </w:r>
-      <w:r>
-        <w:rPr>
-          <w:i/>
-        </w:rPr>
-        <w:t>Scientific Data, 4</w:t>
-      </w:r>
-      <w:r>
-        <w:t>, 170171. https://doi.org/10.1038/sdata.2017.171</w:t>
-      </w:r>
-    </w:p>
-    <w:p>
-      <w:pPr>
-        <w:spacing w:line="480" w:lineRule="auto" w:before="0" w:after="0"/>
-        <w:ind w:left="720" w:hanging="720"/>
-        <w:jc w:val="left"/>
-      </w:pPr>
-      <w:r>
-        <w:t xml:space="preserve">Pedregosa, F., Varoquaux, G., Gramfort, A., Michel, V., Thirion, B., Grisel, O., Blondel, M., Prettenhofer, P., Weiss, R., Dubourg, V., Vanderplas, J., Passos, A., Cournapeau, D., Brucher, M., Perrot, M. y Duchesnay, É. (2011). Scikit-learn: Machine learning in Python. </w:t>
-      </w:r>
-      <w:r>
-        <w:rPr>
-          <w:i/>
-        </w:rPr>
-        <w:t>Journal of Machine Learning Research, 12</w:t>
-      </w:r>
-      <w:r>
-        <w:t>, 2825-2830.</w:t>
-      </w:r>
-    </w:p>
-    <w:p>
-      <w:pPr>
-        <w:pStyle w:val="Heading1"/>
-        <w:spacing w:line="480" w:lineRule="auto" w:before="0" w:after="0"/>
-        <w:ind w:firstLine="0"/>
-        <w:jc w:val="center"/>
-      </w:pPr>
-      <w:r>
-        <w:t>Anexos</w:t>
-      </w:r>
-    </w:p>
-    <w:p>
-      <w:pPr>
-        <w:pStyle w:val="Heading2"/>
-        <w:spacing w:line="480" w:lineRule="auto" w:before="0" w:after="0"/>
-        <w:ind w:firstLine="0"/>
-        <w:jc w:val="left"/>
-      </w:pPr>
-      <w:r>
-        <w:t>Anexo A. Estructura del proyecto</w:t>
-      </w:r>
-    </w:p>
-    <w:p>
-      <w:pPr>
-        <w:spacing w:line="480" w:lineRule="auto" w:before="0" w:after="0"/>
-        <w:ind w:firstLine="720"/>
-        <w:jc w:val="left"/>
-      </w:pPr>
-      <w:r>
-        <w:t xml:space="preserve">Se incluyen el cuaderno Colab, el paquete </w:t>
-      </w:r>
-      <w:r>
-        <w:rPr>
-          <w:rFonts w:ascii="Courier New" w:hAnsi="Courier New"/>
-        </w:rPr>
-        <w:t>src</w:t>
-      </w:r>
-      <w:r>
-        <w:t>, pruebas, documentación y salidas CSV. Las rutas son relativas y el archivo OULAD se descarga desde UCI.</w:t>
-      </w:r>
-    </w:p>
-    <w:p>
-      <w:pPr>
-        <w:spacing w:line="480" w:lineRule="auto" w:before="0" w:after="0"/>
-        <w:ind w:firstLine="720"/>
-        <w:jc w:val="left"/>
-      </w:pPr>
-      <w:r>
-        <w:t>El código, la documentación y las evidencias se encuentran en: https://github.com/marlenis-concepcion/CienciaDatosUasd2026/tree/main/Unidad_4/Practica_04_Proyecto_Final_OULAD</w:t>
-      </w:r>
-    </w:p>
-    <w:p>
-      <w:pPr>
-        <w:spacing w:line="480" w:lineRule="auto" w:before="0" w:after="0"/>
-        <w:ind w:firstLine="720"/>
-        <w:jc w:val="left"/>
-      </w:pPr>
-      <w:r>
-        <w:t>El cuaderno puede abrirse directamente en Google Colab: https://colab.research.google.com/github/marlenis-concepcion/CienciaDatosUasd2026/blob/main/Unidad_4/Practica_04_Proyecto_Final_OULAD/notebooks/Proyecto_Final_OULAD_Colab.ipynb</w:t>
-      </w:r>
-    </w:p>
-    <w:p>
-      <w:pPr>
-        <w:pStyle w:val="Heading2"/>
-        <w:spacing w:line="480" w:lineRule="auto" w:before="0" w:after="0"/>
-        <w:ind w:firstLine="0"/>
-        <w:jc w:val="left"/>
-      </w:pPr>
-      <w:r>
-        <w:t>Anexo B. Salidas reproducibles</w:t>
-      </w:r>
-    </w:p>
-    <w:p>
-      <w:pPr>
-        <w:spacing w:line="480" w:lineRule="auto" w:before="0" w:after="0"/>
-        <w:ind w:firstLine="720"/>
-        <w:jc w:val="left"/>
-      </w:pPr>
-      <w:r>
-        <w:t>Las figuras incluyen EDA, box plot, dispersión, correlación y matrices de confusión. Los CSV incluyen métricas generales, predicciones caso a caso, F1 manual e importancias.</w:t>
-      </w:r>
-    </w:p>
-    <w:p>
-      <w:pPr>
-        <w:pStyle w:val="Heading2"/>
-        <w:spacing w:line="480" w:lineRule="auto" w:before="0" w:after="0"/>
-        <w:ind w:firstLine="0"/>
-        <w:jc w:val="left"/>
-      </w:pPr>
-      <w:r>
-        <w:t>Anexo C. División del trabajo colaborativo</w:t>
-      </w:r>
-    </w:p>
-    <w:p>
-      <w:pPr>
-        <w:spacing w:line="480" w:lineRule="auto" w:before="0" w:after="0"/>
-        <w:ind w:firstLine="720"/>
-        <w:jc w:val="left"/>
-      </w:pPr>
-      <w:r>
-        <w:t>El equipo debe completar la tabla del README con nombres, matrículas, responsabilidad, evidencia revisada y fecha. La integración final debe ser revisada por todos los integrantes.</w:t>
-      </w:r>
-    </w:p>
-    <w:p>
-      <w:pPr>
-        <w:pStyle w:val="Heading2"/>
-        <w:spacing w:line="480" w:lineRule="auto" w:before="0" w:after="0"/>
-        <w:ind w:firstLine="0"/>
-        <w:jc w:val="left"/>
-      </w:pPr>
-      <w:r>
-        <w:t>Anexo D. Declaración sobre Experimento X e IA</w:t>
-      </w:r>
-    </w:p>
-    <w:p>
-      <w:pPr>
-        <w:spacing w:line="480" w:lineRule="auto" w:before="0" w:after="0"/>
-        <w:ind w:firstLine="720"/>
-        <w:jc w:val="left"/>
-      </w:pPr>
-      <w:r>
-        <w:t>Experimento X es sintético y no representa personas ni una institución real. Se utilizaron herramientas de inteligencia artificial como apoyo para estructuración, programación y revisión; el equipo es responsable de ejecutar, verificar, interpretar y aprobar la entrega.</w:t>
+        <w:t>Open University Learning Analytics Dataset (2023). UCI Machine Learning Repository. https://archive.ics.uci.edu/ml/datasets/Open+University+Learning+Analytics+dataset</w:t>
       </w:r>
     </w:p>
     <w:sectPr>
       <w:headerReference w:type="default" r:id="rId9"/>
+      <w:footerReference w:type="default" r:id="rId10"/>
       <w:pgSz w:w="12240" w:h="15840"/>
       <w:pgMar w:top="1440" w:right="1440" w:bottom="1440" w:left="1440" w:header="720" w:footer="720" w:gutter="0"/>
       <w:cols w:space="720"/>
@@ -1101,17 +734,30 @@
 </w:document>
 </file>
 
-<file path=word/header1.xml><?xml version="1.0" encoding="utf-8"?>
-<w:hdr xmlns:m="http://schemas.openxmlformats.org/officeDocument/2006/math" xmlns:mc="http://schemas.openxmlformats.org/markup-compatibility/2006" xmlns:mo="http://schemas.microsoft.com/office/mac/office/2008/main" xmlns:mv="urn:schemas-microsoft-com:mac:vml" xmlns:o="urn:schemas-microsoft-com:office:office" xmlns:r="http://schemas.openxmlformats.org/officeDocument/2006/relationships" xmlns:v="urn:schemas-microsoft-com:vml" xmlns:w10="urn:schemas-microsoft-com:office:word" xmlns:w14="http://schemas.microsoft.com/office/word/2010/wordml" xmlns:w="http://schemas.openxmlformats.org/wordprocessingml/2006/main" xmlns:wne="http://schemas.microsoft.com/office/word/2006/wordml" xmlns:wp14="http://schemas.microsoft.com/office/word/2010/wordprocessingDrawing" xmlns:wp="http://schemas.openxmlformats.org/drawingml/2006/wordprocessingDrawing" xmlns:wpc="http://schemas.microsoft.com/office/word/2010/wordprocessingCanvas" xmlns:wpg="http://schemas.microsoft.com/office/word/2010/wordprocessingGroup" xmlns:wpi="http://schemas.microsoft.com/office/word/2010/wordprocessingInk" xmlns:wps="http://schemas.microsoft.com/office/word/2010/wordprocessingShape" mc:Ignorable="w14 wp14">
+<file path=word/footer1.xml><?xml version="1.0" encoding="utf-8"?>
+<w:ftr xmlns:m="http://schemas.openxmlformats.org/officeDocument/2006/math" xmlns:mc="http://schemas.openxmlformats.org/markup-compatibility/2006" xmlns:mo="http://schemas.microsoft.com/office/mac/office/2008/main" xmlns:mv="urn:schemas-microsoft-com:mac:vml" xmlns:o="urn:schemas-microsoft-com:office:office" xmlns:r="http://schemas.openxmlformats.org/officeDocument/2006/relationships" xmlns:v="urn:schemas-microsoft-com:vml" xmlns:w10="urn:schemas-microsoft-com:office:word" xmlns:w14="http://schemas.microsoft.com/office/word/2010/wordml" xmlns:w="http://schemas.openxmlformats.org/wordprocessingml/2006/main" xmlns:wne="http://schemas.microsoft.com/office/word/2006/wordml" xmlns:wp14="http://schemas.microsoft.com/office/word/2010/wordprocessingDrawing" xmlns:wp="http://schemas.openxmlformats.org/drawingml/2006/wordprocessingDrawing" xmlns:wpc="http://schemas.microsoft.com/office/word/2010/wordprocessingCanvas" xmlns:wpg="http://schemas.microsoft.com/office/word/2010/wordprocessingGroup" xmlns:wpi="http://schemas.microsoft.com/office/word/2010/wordprocessingInk" xmlns:wps="http://schemas.microsoft.com/office/word/2010/wordprocessingShape" mc:Ignorable="w14 wp14">
   <w:p>
     <w:pPr>
-      <w:pStyle w:val="Header"/>
+      <w:pStyle w:val="Footer"/>
       <w:jc w:val="right"/>
     </w:pPr>
     <w:r>
       <w:fldChar w:fldCharType="begin"/>
       <w:instrText xml:space="preserve">PAGE</w:instrText>
       <w:fldChar w:fldCharType="end"/>
+    </w:r>
+  </w:p>
+</w:ftr>
+</file>
+
+<file path=word/header1.xml><?xml version="1.0" encoding="utf-8"?>
+<w:hdr xmlns:m="http://schemas.openxmlformats.org/officeDocument/2006/math" xmlns:mc="http://schemas.openxmlformats.org/markup-compatibility/2006" xmlns:mo="http://schemas.microsoft.com/office/mac/office/2008/main" xmlns:mv="urn:schemas-microsoft-com:mac:vml" xmlns:o="urn:schemas-microsoft-com:office:office" xmlns:r="http://schemas.openxmlformats.org/officeDocument/2006/relationships" xmlns:v="urn:schemas-microsoft-com:vml" xmlns:w10="urn:schemas-microsoft-com:office:word" xmlns:w14="http://schemas.microsoft.com/office/word/2010/wordml" xmlns:w="http://schemas.openxmlformats.org/wordprocessingml/2006/main" xmlns:wne="http://schemas.microsoft.com/office/word/2006/wordml" xmlns:wp14="http://schemas.microsoft.com/office/word/2010/wordprocessingDrawing" xmlns:wp="http://schemas.openxmlformats.org/drawingml/2006/wordprocessingDrawing" xmlns:wpc="http://schemas.microsoft.com/office/word/2010/wordprocessingCanvas" xmlns:wpg="http://schemas.microsoft.com/office/word/2010/wordprocessingGroup" xmlns:wpi="http://schemas.microsoft.com/office/word/2010/wordprocessingInk" xmlns:wps="http://schemas.microsoft.com/office/word/2010/wordprocessingShape" mc:Ignorable="w14 wp14">
+  <w:p>
+    <w:pPr>
+      <w:pStyle w:val="Header"/>
+    </w:pPr>
+    <w:r>
+      <w:t>OULAD Analysis</w:t>
     </w:r>
   </w:p>
 </w:hdr>
@@ -1482,8 +1128,6 @@
     <w:rsid w:val="00FC693F"/>
     <w:pPr>
       <w:spacing w:line="480" w:lineRule="auto" w:before="0" w:after="0"/>
-      <w:ind w:firstLine="720"/>
-      <w:jc w:val="left"/>
     </w:pPr>
     <w:rPr>
       <w:rFonts w:ascii="Times New Roman" w:hAnsi="Times New Roman"/>
@@ -1546,14 +1190,13 @@
       <w:keepNext/>
       <w:keepLines/>
       <w:spacing w:before="0" w:after="0" w:line="480" w:lineRule="auto"/>
-      <w:ind w:firstLine="0"/>
-      <w:jc w:val="center"/>
       <w:outlineLvl w:val="0"/>
     </w:pPr>
     <w:rPr>
       <w:rFonts w:asciiTheme="majorHAnsi" w:eastAsiaTheme="majorEastAsia" w:hAnsiTheme="majorHAnsi" w:cstheme="majorBidi" w:ascii="Times New Roman" w:hAnsi="Times New Roman"/>
       <w:b/>
       <w:bCs/>
+      <w:color w:val="365F91" w:themeColor="accent1" w:themeShade="BF"/>
       <w:sz w:val="24"/>
       <w:szCs w:val="28"/>
     </w:rPr>
@@ -1571,14 +1214,13 @@
       <w:keepNext/>
       <w:keepLines/>
       <w:spacing w:before="0" w:after="0" w:line="480" w:lineRule="auto"/>
-      <w:ind w:firstLine="0"/>
-      <w:jc w:val="left"/>
       <w:outlineLvl w:val="1"/>
     </w:pPr>
     <w:rPr>
       <w:rFonts w:asciiTheme="majorHAnsi" w:eastAsiaTheme="majorEastAsia" w:hAnsiTheme="majorHAnsi" w:cstheme="majorBidi" w:ascii="Times New Roman" w:hAnsi="Times New Roman"/>
       <w:b/>
       <w:bCs/>
+      <w:color w:val="4F81BD" w:themeColor="accent1"/>
       <w:sz w:val="24"/>
       <w:szCs w:val="26"/>
     </w:rPr>
@@ -1596,14 +1238,13 @@
       <w:keepNext/>
       <w:keepLines/>
       <w:spacing w:before="0" w:after="0" w:line="480" w:lineRule="auto"/>
-      <w:ind w:firstLine="0"/>
       <w:outlineLvl w:val="2"/>
     </w:pPr>
     <w:rPr>
       <w:rFonts w:asciiTheme="majorHAnsi" w:eastAsiaTheme="majorEastAsia" w:hAnsiTheme="majorHAnsi" w:cstheme="majorBidi" w:ascii="Times New Roman" w:hAnsi="Times New Roman"/>
       <w:b/>
       <w:bCs/>
-      <w:i/>
+      <w:color w:val="4F81BD" w:themeColor="accent1"/>
       <w:sz w:val="24"/>
     </w:rPr>
   </w:style>
@@ -1838,17 +1479,15 @@
       <w:pBdr>
         <w:bottom w:val="single" w:sz="8" w:space="4" w:color="4F81BD" w:themeColor="accent1"/>
       </w:pBdr>
-      <w:spacing w:after="0" w:line="480" w:lineRule="auto" w:before="0"/>
-      <w:ind w:firstLine="0"/>
+      <w:spacing w:after="300" w:line="240" w:lineRule="auto"/>
       <w:contextualSpacing/>
-      <w:jc w:val="center"/>
     </w:pPr>
     <w:rPr>
-      <w:rFonts w:asciiTheme="majorHAnsi" w:eastAsiaTheme="majorEastAsia" w:hAnsiTheme="majorHAnsi" w:cstheme="majorBidi" w:ascii="Times New Roman" w:hAnsi="Times New Roman"/>
-      <w:b/>
+      <w:rFonts w:asciiTheme="majorHAnsi" w:eastAsiaTheme="majorEastAsia" w:hAnsiTheme="majorHAnsi" w:cstheme="majorBidi"/>
+      <w:color w:val="17365D" w:themeColor="text2" w:themeShade="BF"/>
       <w:spacing w:val="5"/>
       <w:kern w:val="28"/>
-      <w:sz w:val="24"/>
+      <w:sz w:val="52"/>
       <w:szCs w:val="52"/>
     </w:rPr>
   </w:style>

</xml_diff>